<commit_message>
Fixed child birthdate formatting and next steps
</commit_message>
<xml_diff>
--- a/docassemble/NDPowerOfAttorneyForCareAndCustodyOfMinor/data/templates/nd_power_of_attorney_minor_short_form_v2_next_steps.docx
+++ b/docassemble/NDPowerOfAttorneyForCareAndCustodyOfMinor/data/templates/nd_power_of_attorney_minor_short_form_v2_next_steps.docx
@@ -1,6 +1,6 @@
 
 <file path=word/document.xml><?xml version="1.0" encoding="utf-8"?>
-<w:document xmlns:wpc="http://schemas.microsoft.com/office/word/2010/wordprocessingCanvas" xmlns:cx="http://schemas.microsoft.com/office/drawing/2014/chartex" xmlns:cx1="http://schemas.microsoft.com/office/drawing/2015/9/8/chartex" xmlns:cx2="http://schemas.microsoft.com/office/drawing/2015/10/21/chartex" xmlns:cx3="http://schemas.microsoft.com/office/drawing/2016/5/9/chartex" xmlns:cx4="http://schemas.microsoft.com/office/drawing/2016/5/10/chartex" xmlns:cx5="http://schemas.microsoft.com/office/drawing/2016/5/11/chartex" xmlns:cx6="http://schemas.microsoft.com/office/drawing/2016/5/12/chartex" xmlns:cx7="http://schemas.microsoft.com/office/drawing/2016/5/13/chartex" xmlns:cx8="http://schemas.microsoft.com/office/drawing/2016/5/14/chartex" xmlns:mc="http://schemas.openxmlformats.org/markup-compatibility/2006" xmlns:aink="http://schemas.microsoft.com/office/drawing/2016/ink" xmlns:am3d="http://schemas.microsoft.com/office/drawing/2017/model3d" xmlns:o="urn:schemas-microsoft-com:office:office" xmlns:r="http://schemas.openxmlformats.org/officeDocument/2006/relationships" xmlns:m="http://schemas.openxmlformats.org/officeDocument/2006/math" xmlns:v="urn:schemas-microsoft-com:vml" xmlns:wp14="http://schemas.microsoft.com/office/word/2010/wordprocessingDrawing" xmlns:wp="http://schemas.openxmlformats.org/drawingml/2006/wordprocessingDrawing" xmlns:w10="urn:schemas-microsoft-com:office:word" xmlns:w="http://schemas.openxmlformats.org/wordprocessingml/2006/main" xmlns:w14="http://schemas.microsoft.com/office/word/2010/wordml" xmlns:w15="http://schemas.microsoft.com/office/word/2012/wordml" xmlns:w16cid="http://schemas.microsoft.com/office/word/2016/wordml/cid" xmlns:w16se="http://schemas.microsoft.com/office/word/2015/wordml/symex" xmlns:wpg="http://schemas.microsoft.com/office/word/2010/wordprocessingGroup" xmlns:wpi="http://schemas.microsoft.com/office/word/2010/wordprocessingInk" xmlns:wne="http://schemas.microsoft.com/office/word/2006/wordml" xmlns:wps="http://schemas.microsoft.com/office/word/2010/wordprocessingShape" mc:Ignorable="w14 w15 w16se w16cid wp14">
+<w:document xmlns:wpc="http://schemas.microsoft.com/office/word/2010/wordprocessingCanvas" xmlns:cx="http://schemas.microsoft.com/office/drawing/2014/chartex" xmlns:cx1="http://schemas.microsoft.com/office/drawing/2015/9/8/chartex" xmlns:cx2="http://schemas.microsoft.com/office/drawing/2015/10/21/chartex" xmlns:cx3="http://schemas.microsoft.com/office/drawing/2016/5/9/chartex" xmlns:cx4="http://schemas.microsoft.com/office/drawing/2016/5/10/chartex" xmlns:cx5="http://schemas.microsoft.com/office/drawing/2016/5/11/chartex" xmlns:cx6="http://schemas.microsoft.com/office/drawing/2016/5/12/chartex" xmlns:cx7="http://schemas.microsoft.com/office/drawing/2016/5/13/chartex" xmlns:cx8="http://schemas.microsoft.com/office/drawing/2016/5/14/chartex" xmlns:mc="http://schemas.openxmlformats.org/markup-compatibility/2006" xmlns:m="http://schemas.openxmlformats.org/officeDocument/2006/math" xmlns:aink="http://schemas.microsoft.com/office/drawing/2016/ink" xmlns:am3d="http://schemas.microsoft.com/office/drawing/2017/model3d" xmlns:oel="http://schemas.microsoft.com/office/2019/extlst" xmlns:r="http://schemas.openxmlformats.org/officeDocument/2006/relationships" xmlns:wp14="http://schemas.microsoft.com/office/word/2010/wordprocessingDrawing" xmlns:wp="http://schemas.openxmlformats.org/drawingml/2006/wordprocessingDrawing" xmlns:wpg="http://schemas.microsoft.com/office/word/2010/wordprocessingGroup" xmlns:wpi="http://schemas.microsoft.com/office/word/2010/wordprocessingInk" xmlns:wps="http://schemas.microsoft.com/office/word/2010/wordprocessingShape" xmlns:o="urn:schemas-microsoft-com:office:office" xmlns:v="urn:schemas-microsoft-com:vml" xmlns:w10="urn:schemas-microsoft-com:office:word" xmlns:w="http://schemas.openxmlformats.org/wordprocessingml/2006/main" xmlns:w14="http://schemas.microsoft.com/office/word/2010/wordml" xmlns:w15="http://schemas.microsoft.com/office/word/2012/wordml" xmlns:w16cex="http://schemas.microsoft.com/office/word/2018/wordml/cex" xmlns:w16cid="http://schemas.microsoft.com/office/word/2016/wordml/cid" xmlns:w16="http://schemas.microsoft.com/office/word/2018/wordml" xmlns:w16sdtdh="http://schemas.microsoft.com/office/word/2020/wordml/sdtdatahash" xmlns:w16sdtfl="http://schemas.microsoft.com/office/word/2024/wordml/sdtformatlock" xmlns:w16se="http://schemas.microsoft.com/office/word/2015/wordml/symex" xmlns:w16du="http://schemas.microsoft.com/office/word/2023/wordml/word16du" xmlns:wne="http://schemas.microsoft.com/office/word/2006/wordml" mc:Ignorable="w14 w15 w16se w16cid w16 w16cex w16sdtdh w16sdtfl w16du wp14">
   <w:background w:color="FFFFFF"/>
   <w:body>
     <w:p>
@@ -8,7 +8,7 @@
         <w:pStyle w:val="Title"/>
       </w:pPr>
       <w:r>
-        <w:t>{{ al_next_steps_intro_prompt }}</w:t>
+        <w:t>North Dakota Power of Attorney Next Steps</w:t>
       </w:r>
     </w:p>
     <w:p>
@@ -24,39 +24,34 @@
         <w:t xml:space="preserve">Congratulations </w:t>
       </w:r>
       <w:r>
-        <w:t>{_{ users }_}</w:t>
-      </w:r>
-      <w:r>
-        <w:t>! You have finished all the forms you need to {{ al_next_s</w:t>
-      </w:r>
-      <w:r>
-        <w:t>t</w:t>
-      </w:r>
-      <w:r>
-        <w:t>eps_intro_prompt }}. The rest of the pages </w:t>
-      </w:r>
-      <w:r>
-        <w:t>in this packet are your complet</w:t>
-      </w:r>
-      <w:r>
-        <w:t xml:space="preserve">ed</w:t>
-      </w:r>
-      <w:r>
-        <w:rPr>
-          <w:rStyle w:val="pl-s"/>
-        </w:rPr>
-        <w:t> {{ al_next_steps_document_title }}</w:t>
-      </w:r>
-      <w:bookmarkStart w:id="0" w:name="_GoBack"/>
-      <w:bookmarkEnd w:id="0"/>
-      <w:r>
-        <w:t xml:space="preserve">.</w:t>
+        <w:t>{{ users</w:t>
+      </w:r>
+      <w:r>
+        <w:t>[0]</w:t>
+      </w:r>
+      <w:r>
+        <w:t>.name_first</w:t>
+      </w:r>
+      <w:r>
+        <w:t xml:space="preserve"> }}</w:t>
+      </w:r>
+      <w:r>
+        <w:t xml:space="preserve">! You have finished </w:t>
+      </w:r>
+      <w:r>
+        <w:t>your form.</w:t>
       </w:r>
     </w:p>
     <w:p/>
     <w:p>
       <w:pPr>
         <w:sectPr>
+          <w:headerReference w:type="even" r:id="rId7"/>
+          <w:headerReference w:type="default" r:id="rId8"/>
+          <w:footerReference w:type="even" r:id="rId9"/>
+          <w:footerReference w:type="default" r:id="rId10"/>
+          <w:headerReference w:type="first" r:id="rId11"/>
+          <w:footerReference w:type="first" r:id="rId12"/>
           <w:pgSz w:w="12240" w:h="15840"/>
           <w:pgMar w:top="720" w:right="720" w:bottom="720" w:left="720" w:header="0" w:footer="0" w:gutter="0"/>
           <w:pgNumType w:start="1"/>
@@ -71,10 +66,24 @@
       <w:pPr>
         <w:pStyle w:val="Heading2"/>
       </w:pPr>
-      <w:bookmarkStart w:id="1" w:name="_yntzxzfdh9ya"/>
+      <w:bookmarkStart w:id="0" w:name="_yntzxzfdh9ya"/>
+      <w:bookmarkStart w:id="1" w:name="_4szgtqe6ov1h"/>
+      <w:bookmarkEnd w:id="0"/>
       <w:bookmarkEnd w:id="1"/>
       <w:r>
-        <w:t>Next steps</w:t>
+        <w:t>What happens next?</w:t>
+      </w:r>
+    </w:p>
+    <w:p>
+      <w:pPr>
+        <w:pStyle w:val="NumberedList"/>
+        <w:numPr>
+          <w:ilvl w:val="0"/>
+          <w:numId w:val="3"/>
+        </w:numPr>
+      </w:pPr>
+      <w:r>
+        <w:t xml:space="preserve">Look over the forms below, one more time. Make sure everything is correct. </w:t>
       </w:r>
     </w:p>
     <w:p>
@@ -82,7 +91,19 @@
         <w:pStyle w:val="ListParagraph"/>
         <w:numPr>
           <w:ilvl w:val="0"/>
-          <w:numId w:val="1"/>
+          <w:numId w:val="3"/>
+        </w:numPr>
+      </w:pPr>
+      <w:r>
+        <w:t>After completing the form, sign it with a notary or court clerk.</w:t>
+      </w:r>
+    </w:p>
+    <w:p>
+      <w:pPr>
+        <w:pStyle w:val="ListParagraph"/>
+        <w:numPr>
+          <w:ilvl w:val="0"/>
+          <w:numId w:val="3"/>
         </w:numPr>
         <w:suppressAutoHyphens/>
         <w:snapToGrid w:val="0"/>
@@ -102,47 +123,7 @@
             <w14:bevel/>
           </w14:textOutline>
         </w:rPr>
-        <w:t xml:space="preserve">Deliver a copy to </w:t>
-      </w:r>
-      <w:r>
-        <w:rPr>
-          <w14:textOutline w14:w="9525" w14:cap="rnd" w14:cmpd="sng" w14:algn="ctr">
-            <w14:noFill/>
-            <w14:prstDash w14:val="solid"/>
-            <w14:bevel/>
-          </w14:textOutline>
-        </w:rPr>
-        <w:t xml:space="preserve">{_{ </w:t>
-      </w:r>
-      <w:r>
-        <w:rPr>
-          <w14:textOutline w14:w="9525" w14:cap="rnd" w14:cmpd="sng" w14:algn="ctr">
-            <w14:noFill/>
-            <w14:prstDash w14:val="solid"/>
-            <w14:bevel/>
-          </w14:textOutline>
-        </w:rPr>
-        <w:t xml:space="preserve">showifdef('other_parties[0]') </w:t>
-      </w:r>
-      <w:r>
-        <w:rPr>
-          <w14:textOutline w14:w="9525" w14:cap="rnd" w14:cmpd="sng" w14:algn="ctr">
-            <w14:noFill/>
-            <w14:prstDash w14:val="solid"/>
-            <w14:bevel/>
-          </w14:textOutline>
-        </w:rPr>
-        <w:t>}_}</w:t>
-      </w:r>
-      <w:r>
-        <w:rPr>
-          <w14:textOutline w14:w="9525" w14:cap="rnd" w14:cmpd="sng" w14:algn="ctr">
-            <w14:noFill/>
-            <w14:prstDash w14:val="solid"/>
-            <w14:bevel/>
-          </w14:textOutline>
-        </w:rPr>
-        <w:t xml:space="preserve"> or their attorney.</w:t>
+        <w:t>Give a copy to {{ attorney_in_fact[0] }}</w:t>
       </w:r>
     </w:p>
     <w:p>
@@ -150,7 +131,7 @@
         <w:pStyle w:val="ListParagraph"/>
         <w:numPr>
           <w:ilvl w:val="0"/>
-          <w:numId w:val="1"/>
+          <w:numId w:val="3"/>
         </w:numPr>
         <w:suppressAutoHyphens/>
         <w:snapToGrid w:val="0"/>
@@ -179,12 +160,14 @@
     </w:p>
     <w:p>
       <w:pPr>
-        <w:pStyle w:val="ListParagraph"/>
-        <w:numPr>
-          <w:ilvl w:val="0"/>
-          <w:numId w:val="1"/>
-        </w:numPr>
-        <w:snapToGrid w:val="0"/>
+        <w:pStyle w:val="Heading2"/>
+      </w:pPr>
+      <w:bookmarkStart w:id="2" w:name="_7jbtnvplu76"/>
+      <w:bookmarkEnd w:id="2"/>
+      <w:r>
+        <w:t xml:space="preserve">What can </w:t>
+      </w:r>
+      <w:r>
         <w:rPr>
           <w14:textOutline w14:w="9525" w14:cap="rnd" w14:cmpd="sng" w14:algn="ctr">
             <w14:noFill/>
@@ -192,182 +175,7 @@
             <w14:bevel/>
           </w14:textOutline>
         </w:rPr>
-      </w:pPr>
-      <w:r>
-        <w:rPr>
-          <w14:textOutline w14:w="9525" w14:cap="rnd" w14:cmpd="sng" w14:algn="ctr">
-            <w14:noFill/>
-            <w14:prstDash w14:val="solid"/>
-            <w14:bevel/>
-          </w14:textOutline>
-        </w:rPr>
-        <w:t xml:space="preserve">Wait for a response from </w:t>
-      </w:r>
-      <w:r>
-        <w:rPr>
-          <w14:textOutline w14:w="9525" w14:cap="rnd" w14:cmpd="sng" w14:algn="ctr">
-            <w14:noFill/>
-            <w14:prstDash w14:val="solid"/>
-            <w14:bevel/>
-          </w14:textOutline>
-        </w:rPr>
-        <w:t xml:space="preserve">{_{ </w:t>
-      </w:r>
-      <w:r>
-        <w:rPr>
-          <w14:textOutline w14:w="9525" w14:cap="rnd" w14:cmpd="sng" w14:algn="ctr">
-            <w14:noFill/>
-            <w14:prstDash w14:val="solid"/>
-            <w14:bevel/>
-          </w14:textOutline>
-        </w:rPr>
-        <w:t xml:space="preserve">showifdef('other_parties[0]') </w:t>
-      </w:r>
-      <w:r>
-        <w:rPr>
-          <w14:textOutline w14:w="9525" w14:cap="rnd" w14:cmpd="sng" w14:algn="ctr">
-            <w14:noFill/>
-            <w14:prstDash w14:val="solid"/>
-            <w14:bevel/>
-          </w14:textOutline>
-        </w:rPr>
-        <w:t>}_}</w:t>
-      </w:r>
-      <w:r>
-        <w:t>.</w:t>
-      </w:r>
-    </w:p>
-    <w:p>
-      <w:pPr>
-        <w:pStyle w:val="Heading2"/>
-      </w:pPr>
-      <w:bookmarkStart w:id="2" w:name="_4szgtqe6ov1h"/>
-      <w:bookmarkEnd w:id="2"/>
-      <w:r>
-        <w:t>What happens next?</w:t>
-      </w:r>
-    </w:p>
-    <w:p>
-      <w:pPr>
-        <w:pStyle w:val="NumberedList"/>
-        <w:numPr>
-          <w:ilvl w:val="0"/>
-          <w:numId w:val="3"/>
-        </w:numPr>
-      </w:pPr>
-      <w:r>
-        <w:t xml:space="preserve">Look over the forms below, one more time. Make sure everything is correct. </w:t>
-      </w:r>
-    </w:p>
-    <w:p>
-      <w:pPr>
-        <w:pStyle w:val="NumberedList"/>
-        <w:numPr>
-          <w:ilvl w:val="0"/>
-          <w:numId w:val="3"/>
-        </w:numPr>
-      </w:pPr>
-      <w:r>
-        <w:t xml:space="preserve">{%p if </w:t>
-      </w:r>
-      <w:r>
-        <w:t>al_next_steps_enabled and al_n</w:t>
-      </w:r>
-      <w:r>
-        <w:t xml:space="preserve">ext_s</w:t>
-      </w:r>
-      <w:r>
-        <w:t>teps_what_happens_next %}</w:t>
-      </w:r>
-      <w:r>
-        <w:t xml:space="preserve"/>
-      </w:r>
-    </w:p>
-    <w:p>
-      <w:pPr>
-        <w:pStyle w:val="ListParagraph"/>
-        <w:numPr>
-          <w:ilvl w:val="0"/>
-          <w:numId w:val="3"/>
-        </w:numPr>
-      </w:pPr>
-      <w:r>
-        <w:t xml:space="preserve">{%p for line in </w:t>
-      </w:r>
-      <w:r>
-        <w:t>al_next_steps_what_happens_next.split("\n") %}</w:t>
-      </w:r>
-      <w:r>
-        <w:t/>
-      </w:r>
-    </w:p>
-    <w:p>
-      <w:pPr>
-        <w:pStyle w:val="ListParagraph"/>
-        <w:numPr>
-          <w:ilvl w:val="0"/>
-          <w:numId w:val="3"/>
-        </w:numPr>
-      </w:pPr>
-      <w:r>
-        <w:t>{{ fix_punctuation(line) }}</w:t>
-      </w:r>
-    </w:p>
-    <w:p>
-      <w:pPr>
-        <w:pStyle w:val="ListParagraph"/>
-        <w:numPr>
-          <w:ilvl w:val="0"/>
-          <w:numId w:val="3"/>
-        </w:numPr>
-      </w:pPr>
-      <w:r>
-        <w:t>{%p endfor %}</w:t>
-      </w:r>
-    </w:p>
-    <w:p>
-      <w:pPr>
-        <w:pStyle w:val="ListParagraph"/>
-        <w:numPr>
-          <w:ilvl w:val="0"/>
-          <w:numId w:val="3"/>
-        </w:numPr>
-      </w:pPr>
-      <w:r>
-        <w:t>{%p endif %}</w:t>
-      </w:r>
-    </w:p>
-    <w:p>
-      <w:pPr>
-        <w:pStyle w:val="Heading2"/>
-      </w:pPr>
-      <w:bookmarkStart w:id="3" w:name="_7jbtnvplu76"/>
-      <w:bookmarkEnd w:id="3"/>
-      <w:r>
-        <w:t xml:space="preserve">What can </w:t>
-      </w:r>
-      <w:r>
-        <w:t xml:space="preserve">{_{ </w:t>
-      </w:r>
-      <w:r>
-        <w:rPr>
-          <w14:textOutline w14:w="9525" w14:cap="rnd" w14:cmpd="sng" w14:algn="ctr">
-            <w14:noFill/>
-            <w14:prstDash w14:val="solid"/>
-            <w14:bevel/>
-          </w14:textOutline>
-        </w:rPr>
-        <w:t xml:space="preserve">showifdef('other_parties[0]') </w:t>
-      </w:r>
-      <w:r>
-        <w:rPr>
-          <w14:textOutline w14:w="9525" w14:cap="rnd" w14:cmpd="sng" w14:algn="ctr">
-            <w14:noFill/>
-            <w14:prstDash w14:val="solid"/>
-            <w14:bevel/>
-          </w14:textOutline>
-        </w:rPr>
-        <w:t>}_}</w:t>
+        <w:t>{{ attorney_in_fact[0] }}</w:t>
       </w:r>
       <w:r>
         <w:rPr>
@@ -384,318 +192,117 @@
       </w:r>
     </w:p>
     <w:p>
-      <w:r>
-        <w:t xml:space="preserve">{%p if </w:t>
-      </w:r>
-      <w:r>
-        <w:t>al_next_steps_enabled and al_n</w:t>
-      </w:r>
-      <w:r>
-        <w:t xml:space="preserve">ext_s</w:t>
-      </w:r>
-      <w:r>
-        <w:t>teps_what_can_decision_maker_do %}</w:t>
-      </w:r>
-      <w:r>
-        <w:t xml:space="preserve"/>
+      <w:pPr>
+        <w:pStyle w:val="NumberedList"/>
+        <w:numPr>
+          <w:ilvl w:val="0"/>
+          <w:numId w:val="10"/>
+        </w:numPr>
+      </w:pPr>
+      <w:r>
+        <w:t>{{ attorney_in_fact[0] }} can make the choices that you gave them when you filled out the form. They can care for your child(ren) in the ways you chose. They cannot consent to marriage or adoption.</w:t>
       </w:r>
     </w:p>
     <w:p>
       <w:pPr>
-        <w:pStyle w:val="ListParagraph"/>
+        <w:pStyle w:val="NumberedList"/>
         <w:numPr>
           <w:ilvl w:val="0"/>
-          <w:numId w:val="8"/>
+          <w:numId w:val="10"/>
         </w:numPr>
-        <w:ind w:left="360"/>
-      </w:pPr>
-      <w:r>
-        <w:t xml:space="preserve">{%p for line in </w:t>
-      </w:r>
-      <w:r>
-        <w:t>al_next_steps_what_can_decision_maker_do.split("\n") %}</w:t>
-      </w:r>
-      <w:r>
-        <w:t/>
+      </w:pPr>
+      <w:r>
+        <w:t>You can take back your powers at any time. If you want to take back your powers before the end date on the form, you can write a letter to the court.</w:t>
       </w:r>
     </w:p>
     <w:p>
       <w:pPr>
-        <w:pStyle w:val="ListParagraph"/>
-        <w:numPr>
-          <w:ilvl w:val="0"/>
-          <w:numId w:val="8"/>
-        </w:numPr>
-        <w:ind w:left="360"/>
-      </w:pPr>
-      <w:r>
-        <w:t>{{ fix_punctuation(line) }}</w:t>
+        <w:pStyle w:val="Heading2"/>
+        <w:keepNext/>
+      </w:pPr>
+      <w:bookmarkStart w:id="3" w:name="_jpvqkqfibwqh"/>
+      <w:bookmarkStart w:id="4" w:name="_wjzvjugefec1"/>
+      <w:bookmarkEnd w:id="3"/>
+      <w:bookmarkEnd w:id="4"/>
+      <w:r>
+        <w:t>Learn more</w:t>
       </w:r>
     </w:p>
     <w:p>
       <w:pPr>
-        <w:pStyle w:val="ListParagraph"/>
-        <w:numPr>
-          <w:ilvl w:val="0"/>
-          <w:numId w:val="8"/>
-        </w:numPr>
-        <w:ind w:left="360"/>
-      </w:pPr>
-      <w:r>
-        <w:t>{%p endfor %}</w:t>
+        <w:keepNext/>
+      </w:pPr>
+      <w:r>
+        <w:t xml:space="preserve">{%p if </w:t>
+      </w:r>
+      <w:r>
+        <w:t>al_next_steps_enabled %}</w:t>
       </w:r>
     </w:p>
     <w:p>
-      <w:r>
-        <w:t>{%p endif %}</w:t>
-      </w:r>
-    </w:p>
-    <w:p>
-      <w:pPr>
-        <w:pStyle w:val="Heading2"/>
-      </w:pPr>
-      <w:r>
-        <w:t xml:space="preserve">What happens after </w:t>
-      </w:r>
-      <w:r>
-        <w:t xml:space="preserve">{_{ </w:t>
-      </w:r>
-      <w:r>
+      <w:pPr>
+        <w:keepNext/>
         <w:rPr>
-          <w14:textOutline w14:w="9525" w14:cap="rnd" w14:cmpd="sng" w14:algn="ctr">
-            <w14:noFill/>
-            <w14:prstDash w14:val="solid"/>
-            <w14:bevel/>
-          </w14:textOutline>
+          <w:bCs/>
         </w:rPr>
-        <w:t xml:space="preserve">showifdef('other_parties[0]') </w:t>
+      </w:pPr>
+      <w:r>
+        <w:t>If you have questions,</w:t>
+      </w:r>
+      <w:r>
+        <w:t xml:space="preserve"> </w:t>
       </w:r>
       <w:r>
         <w:rPr>
-          <w14:textOutline w14:w="9525" w14:cap="rnd" w14:cmpd="sng" w14:algn="ctr">
-            <w14:noFill/>
-            <w14:prstDash w14:val="solid"/>
-            <w14:bevel/>
-          </w14:textOutline>
+          <w:bCs/>
         </w:rPr>
-        <w:t>}_}</w:t>
-      </w:r>
-      <w:r>
-        <w:t xml:space="preserve"> </w:t>
-      </w:r>
-      <w:proofErr w:type="gramStart"/>
-      <w:r>
-        <w:t>makes a decision</w:t>
-      </w:r>
-      <w:proofErr w:type="gramEnd"/>
-      <w:r>
-        <w:t>?</w:t>
-      </w:r>
-    </w:p>
-    <w:p>
-      <w:r>
-        <w:t>If the judge decides to grant your appeal:</w:t>
-      </w:r>
-    </w:p>
-    <w:p>
-      <w:r>
-        <w:t xml:space="preserve">{%p if </w:t>
-      </w:r>
-      <w:r>
-        <w:t>al_next_steps_enabled and al_n</w:t>
-      </w:r>
-      <w:r>
-        <w:t xml:space="preserve">ext_s</w:t>
-      </w:r>
-      <w:r>
-        <w:t>teps_what_can_decision_maker_do %}</w:t>
-      </w:r>
-      <w:r>
-        <w:t xml:space="preserve"/>
-      </w:r>
-    </w:p>
-    <w:p>
-      <w:pPr>
-        <w:pStyle w:val="ListParagraph"/>
-        <w:numPr>
-          <w:ilvl w:val="0"/>
-          <w:numId w:val="9"/>
-        </w:numPr>
-        <w:ind w:left="360"/>
-      </w:pPr>
-      <w:r>
-        <w:t xml:space="preserve">{%p for line in </w:t>
-      </w:r>
-      <w:r>
-        <w:t>al_next_steps_what_happens_if_i_win.split("\n") %}</w:t>
-      </w:r>
-      <w:r>
-        <w:t/>
-      </w:r>
-    </w:p>
-    <w:p>
-      <w:pPr>
-        <w:pStyle w:val="ListParagraph"/>
-        <w:numPr>
-          <w:ilvl w:val="0"/>
-          <w:numId w:val="9"/>
-        </w:numPr>
-        <w:ind w:left="360"/>
-      </w:pPr>
-      <w:r>
-        <w:t>{{ fix_punctuation(line) }}</w:t>
-      </w:r>
-    </w:p>
-    <w:p>
-      <w:pPr>
-        <w:pStyle w:val="ListParagraph"/>
-        <w:numPr>
-          <w:ilvl w:val="0"/>
-          <w:numId w:val="9"/>
-        </w:numPr>
-        <w:ind w:left="360"/>
-      </w:pPr>
-      <w:r>
-        <w:t>{%p endfor %}</w:t>
-      </w:r>
-    </w:p>
-    <w:p>
-      <w:r>
-        <w:t>{%p endif %}</w:t>
-      </w:r>
-    </w:p>
-    <w:p>
-      <w:pPr>
+        <w:t>{{ al_next_steps_help_</w:t>
+      </w:r>
+      <w:r>
+        <w:rPr>
+          <w:bCs/>
+        </w:rPr>
+        <w:t>organization</w:t>
+      </w:r>
+      <w:r>
+        <w:rPr>
+          <w:bCs/>
+        </w:rPr>
+        <w:t xml:space="preserve"> }}</w:t>
+      </w:r>
+      <w:r>
         <w:rPr>
           <w:b/>
         </w:rPr>
-      </w:pPr>
+        <w:t xml:space="preserve"> </w:t>
+      </w:r>
+      <w:r>
+        <w:rPr>
+          <w:bCs/>
+        </w:rPr>
+        <w:t>may be able to help you</w:t>
+      </w:r>
+      <w:r>
+        <w:rPr>
+          <w:bCs/>
+        </w:rPr>
+        <w:t>: {{ al_next_steps_help_url }}</w:t>
+      </w:r>
     </w:p>
     <w:p>
-      <w:r>
-        <w:rPr>
-          <w:b/>
-        </w:rPr>
-        <w:t xml:space="preserve">Read </w:t>
-      </w:r>
-      <w:r>
-        <w:t>the response as soon as you get it. If you have questions, {{ al_next_steps_help_organization or "Your local legal aid" }} may be able to help you more.</w:t>
+      <w:pPr>
+        <w:keepNext/>
+      </w:pPr>
+      <w:r>
+        <w:t>You can also visit the North Dakota courts legal self help center: {{ al_next_steps_nd_court_self_help }}</w:t>
       </w:r>
     </w:p>
     <w:p>
       <w:pPr>
-        <w:pStyle w:val="Heading2"/>
         <w:keepNext/>
       </w:pPr>
-      <w:bookmarkStart w:id="4" w:name="_jpvqkqfibwqh"/>
-      <w:bookmarkStart w:id="5" w:name="_wjzvjugefec1"/>
-      <w:bookmarkEnd w:id="4"/>
-      <w:bookmarkEnd w:id="5"/>
-      <w:r>
-        <w:t>Learn more</w:t>
-      </w:r>
-    </w:p>
-    <w:p>
-      <w:pPr>
-        <w:keepNext/>
-      </w:pPr>
-      <w:r>
-        <w:t xml:space="preserve">{%p if </w:t>
-      </w:r>
-      <w:r>
-        <w:t>al_next_steps_enabled %}</w:t>
-      </w:r>
-      <w:r>
-        <w:t xml:space="preserve"/>
-      </w:r>
-    </w:p>
-    <w:p>
-      <w:pPr>
-        <w:keepNext/>
-        <w:rPr>
-          <w:b/>
-        </w:rPr>
-      </w:pPr>
-      <w:r>
-        <w:t xml:space="preserve">Visit </w:t>
-      </w:r>
-      <w:r>
-        <w:rPr>
-          <w:b/>
-        </w:rPr>
-        <w:t>{{ al_next_steps_help_url }}</w:t>
-      </w:r>
-    </w:p>
-    <w:p>
-      <w:pPr>
-        <w:keepNext/>
-      </w:pPr>
       <w:r>
         <w:t xml:space="preserve">{%p endif %} </w:t>
-      </w:r>
-    </w:p>
-    <w:p>
-      <w:pPr>
-        <w:pStyle w:val="Footer"/>
-        <w:keepNext/>
-      </w:pPr>
-      <w:r>
-        <w:t>{%</w:t>
-      </w:r>
-      <w:r>
-        <w:t>p</w:t>
-      </w:r>
-      <w:r>
-        <w:t xml:space="preserve"> if al_next_steps_generate_qr_code %}</w:t>
-      </w:r>
-    </w:p>
-    <w:p>
-      <w:pPr>
-        <w:keepNext/>
-      </w:pPr>
-      <w:r>
-        <w:t>or use the QR code below:</w:t>
-      </w:r>
-    </w:p>
-    <w:p>
-      <w:pPr>
-        <w:keepNext/>
-        <w:jc w:val="center"/>
-      </w:pPr>
-      <w:r>
-        <w:t>{</w:t>
-      </w:r>
-      <w:r>
-        <w:t>{p</w:t>
-      </w:r>
-      <w:r>
-        <w:t xml:space="preserve"> qr_code(al_next_steps_help_url, width</w:t>
-      </w:r>
-      <w:r>
-        <w:t>="1in", alt_text="al_next</w:t>
-      </w:r>
-      <w:r>
-        <w:t>_steps_help_url") | markdown </w:t>
-      </w:r>
-      <w:r>
-        <w:t>}</w:t>
-      </w:r>
-      <w:r>
-        <w:t>}</w:t>
-      </w:r>
-      <w:r>
-        <w:t xml:space="preserve"/>
-      </w:r>
-      <w:r>
-        <w:t/>
-      </w:r>
-    </w:p>
-    <w:p>
-      <w:pPr>
-        <w:keepNext/>
-      </w:pPr>
-      <w:r>
-        <w:t>{%p endif %}</w:t>
       </w:r>
     </w:p>
     <w:sectPr>
@@ -711,7 +318,7 @@
 </file>
 
 <file path=word/endnotes.xml><?xml version="1.0" encoding="utf-8"?>
-<w:endnotes xmlns:wpc="http://schemas.microsoft.com/office/word/2010/wordprocessingCanvas" xmlns:cx="http://schemas.microsoft.com/office/drawing/2014/chartex" xmlns:cx1="http://schemas.microsoft.com/office/drawing/2015/9/8/chartex" xmlns:cx2="http://schemas.microsoft.com/office/drawing/2015/10/21/chartex" xmlns:cx3="http://schemas.microsoft.com/office/drawing/2016/5/9/chartex" xmlns:cx4="http://schemas.microsoft.com/office/drawing/2016/5/10/chartex" xmlns:cx5="http://schemas.microsoft.com/office/drawing/2016/5/11/chartex" xmlns:cx6="http://schemas.microsoft.com/office/drawing/2016/5/12/chartex" xmlns:cx7="http://schemas.microsoft.com/office/drawing/2016/5/13/chartex" xmlns:cx8="http://schemas.microsoft.com/office/drawing/2016/5/14/chartex" xmlns:mc="http://schemas.openxmlformats.org/markup-compatibility/2006" xmlns:aink="http://schemas.microsoft.com/office/drawing/2016/ink" xmlns:am3d="http://schemas.microsoft.com/office/drawing/2017/model3d" xmlns:o="urn:schemas-microsoft-com:office:office" xmlns:r="http://schemas.openxmlformats.org/officeDocument/2006/relationships" xmlns:m="http://schemas.openxmlformats.org/officeDocument/2006/math" xmlns:v="urn:schemas-microsoft-com:vml" xmlns:wp14="http://schemas.microsoft.com/office/word/2010/wordprocessingDrawing" xmlns:wp="http://schemas.openxmlformats.org/drawingml/2006/wordprocessingDrawing" xmlns:w10="urn:schemas-microsoft-com:office:word" xmlns:w="http://schemas.openxmlformats.org/wordprocessingml/2006/main" xmlns:w14="http://schemas.microsoft.com/office/word/2010/wordml" xmlns:w15="http://schemas.microsoft.com/office/word/2012/wordml" xmlns:w16cid="http://schemas.microsoft.com/office/word/2016/wordml/cid" xmlns:w16se="http://schemas.microsoft.com/office/word/2015/wordml/symex" xmlns:wpg="http://schemas.microsoft.com/office/word/2010/wordprocessingGroup" xmlns:wpi="http://schemas.microsoft.com/office/word/2010/wordprocessingInk" xmlns:wne="http://schemas.microsoft.com/office/word/2006/wordml" xmlns:wps="http://schemas.microsoft.com/office/word/2010/wordprocessingShape" mc:Ignorable="w14 w15 w16se w16cid wp14">
+<w:endnotes xmlns:wpc="http://schemas.microsoft.com/office/word/2010/wordprocessingCanvas" xmlns:cx="http://schemas.microsoft.com/office/drawing/2014/chartex" xmlns:cx1="http://schemas.microsoft.com/office/drawing/2015/9/8/chartex" xmlns:cx2="http://schemas.microsoft.com/office/drawing/2015/10/21/chartex" xmlns:cx3="http://schemas.microsoft.com/office/drawing/2016/5/9/chartex" xmlns:cx4="http://schemas.microsoft.com/office/drawing/2016/5/10/chartex" xmlns:cx5="http://schemas.microsoft.com/office/drawing/2016/5/11/chartex" xmlns:cx6="http://schemas.microsoft.com/office/drawing/2016/5/12/chartex" xmlns:cx7="http://schemas.microsoft.com/office/drawing/2016/5/13/chartex" xmlns:cx8="http://schemas.microsoft.com/office/drawing/2016/5/14/chartex" xmlns:mc="http://schemas.openxmlformats.org/markup-compatibility/2006" xmlns:m="http://schemas.openxmlformats.org/officeDocument/2006/math" xmlns:aink="http://schemas.microsoft.com/office/drawing/2016/ink" xmlns:am3d="http://schemas.microsoft.com/office/drawing/2017/model3d" xmlns:oel="http://schemas.microsoft.com/office/2019/extlst" xmlns:r="http://schemas.openxmlformats.org/officeDocument/2006/relationships" xmlns:wp14="http://schemas.microsoft.com/office/word/2010/wordprocessingDrawing" xmlns:wp="http://schemas.openxmlformats.org/drawingml/2006/wordprocessingDrawing" xmlns:wpg="http://schemas.microsoft.com/office/word/2010/wordprocessingGroup" xmlns:wpi="http://schemas.microsoft.com/office/word/2010/wordprocessingInk" xmlns:wps="http://schemas.microsoft.com/office/word/2010/wordprocessingShape" xmlns:o="urn:schemas-microsoft-com:office:office" xmlns:v="urn:schemas-microsoft-com:vml" xmlns:w10="urn:schemas-microsoft-com:office:word" xmlns:w="http://schemas.openxmlformats.org/wordprocessingml/2006/main" xmlns:w14="http://schemas.microsoft.com/office/word/2010/wordml" xmlns:w15="http://schemas.microsoft.com/office/word/2012/wordml" xmlns:w16cex="http://schemas.microsoft.com/office/word/2018/wordml/cex" xmlns:w16cid="http://schemas.microsoft.com/office/word/2016/wordml/cid" xmlns:w16="http://schemas.microsoft.com/office/word/2018/wordml" xmlns:w16sdtdh="http://schemas.microsoft.com/office/word/2020/wordml/sdtdatahash" xmlns:w16sdtfl="http://schemas.microsoft.com/office/word/2024/wordml/sdtformatlock" xmlns:w16se="http://schemas.microsoft.com/office/word/2015/wordml/symex" xmlns:w16du="http://schemas.microsoft.com/office/word/2023/wordml/word16du" xmlns:wne="http://schemas.microsoft.com/office/word/2006/wordml" mc:Ignorable="w14 w15 w16se w16cid w16 w16cex w16sdtdh w16sdtfl w16du wp14">
   <w:endnote w:type="separator" w:id="-1">
     <w:p>
       <w:pPr>
@@ -735,8 +342,38 @@
 </w:endnotes>
 </file>
 
+<file path=word/footer1.xml><?xml version="1.0" encoding="utf-8"?>
+<w:ftr xmlns:wpc="http://schemas.microsoft.com/office/word/2010/wordprocessingCanvas" xmlns:cx="http://schemas.microsoft.com/office/drawing/2014/chartex" xmlns:cx1="http://schemas.microsoft.com/office/drawing/2015/9/8/chartex" xmlns:cx2="http://schemas.microsoft.com/office/drawing/2015/10/21/chartex" xmlns:cx3="http://schemas.microsoft.com/office/drawing/2016/5/9/chartex" xmlns:cx4="http://schemas.microsoft.com/office/drawing/2016/5/10/chartex" xmlns:cx5="http://schemas.microsoft.com/office/drawing/2016/5/11/chartex" xmlns:cx6="http://schemas.microsoft.com/office/drawing/2016/5/12/chartex" xmlns:cx7="http://schemas.microsoft.com/office/drawing/2016/5/13/chartex" xmlns:cx8="http://schemas.microsoft.com/office/drawing/2016/5/14/chartex" xmlns:mc="http://schemas.openxmlformats.org/markup-compatibility/2006" xmlns:m="http://schemas.openxmlformats.org/officeDocument/2006/math" xmlns:aink="http://schemas.microsoft.com/office/drawing/2016/ink" xmlns:am3d="http://schemas.microsoft.com/office/drawing/2017/model3d" xmlns:oel="http://schemas.microsoft.com/office/2019/extlst" xmlns:r="http://schemas.openxmlformats.org/officeDocument/2006/relationships" xmlns:wp14="http://schemas.microsoft.com/office/word/2010/wordprocessingDrawing" xmlns:wp="http://schemas.openxmlformats.org/drawingml/2006/wordprocessingDrawing" xmlns:wpg="http://schemas.microsoft.com/office/word/2010/wordprocessingGroup" xmlns:wpi="http://schemas.microsoft.com/office/word/2010/wordprocessingInk" xmlns:wps="http://schemas.microsoft.com/office/word/2010/wordprocessingShape" xmlns:o="urn:schemas-microsoft-com:office:office" xmlns:v="urn:schemas-microsoft-com:vml" xmlns:w10="urn:schemas-microsoft-com:office:word" xmlns:w="http://schemas.openxmlformats.org/wordprocessingml/2006/main" xmlns:w14="http://schemas.microsoft.com/office/word/2010/wordml" xmlns:w15="http://schemas.microsoft.com/office/word/2012/wordml" xmlns:w16cex="http://schemas.microsoft.com/office/word/2018/wordml/cex" xmlns:w16cid="http://schemas.microsoft.com/office/word/2016/wordml/cid" xmlns:w16="http://schemas.microsoft.com/office/word/2018/wordml" xmlns:w16sdtdh="http://schemas.microsoft.com/office/word/2020/wordml/sdtdatahash" xmlns:w16sdtfl="http://schemas.microsoft.com/office/word/2024/wordml/sdtformatlock" xmlns:w16se="http://schemas.microsoft.com/office/word/2015/wordml/symex" xmlns:w16du="http://schemas.microsoft.com/office/word/2023/wordml/word16du" xmlns:wne="http://schemas.microsoft.com/office/word/2006/wordml" mc:Ignorable="w14 w15 w16se w16cid w16 w16cex w16sdtdh w16sdtfl w16du wp14">
+  <w:p>
+    <w:pPr>
+      <w:pStyle w:val="Footer"/>
+    </w:pPr>
+  </w:p>
+</w:ftr>
+</file>
+
+<file path=word/footer2.xml><?xml version="1.0" encoding="utf-8"?>
+<w:ftr xmlns:wpc="http://schemas.microsoft.com/office/word/2010/wordprocessingCanvas" xmlns:cx="http://schemas.microsoft.com/office/drawing/2014/chartex" xmlns:cx1="http://schemas.microsoft.com/office/drawing/2015/9/8/chartex" xmlns:cx2="http://schemas.microsoft.com/office/drawing/2015/10/21/chartex" xmlns:cx3="http://schemas.microsoft.com/office/drawing/2016/5/9/chartex" xmlns:cx4="http://schemas.microsoft.com/office/drawing/2016/5/10/chartex" xmlns:cx5="http://schemas.microsoft.com/office/drawing/2016/5/11/chartex" xmlns:cx6="http://schemas.microsoft.com/office/drawing/2016/5/12/chartex" xmlns:cx7="http://schemas.microsoft.com/office/drawing/2016/5/13/chartex" xmlns:cx8="http://schemas.microsoft.com/office/drawing/2016/5/14/chartex" xmlns:mc="http://schemas.openxmlformats.org/markup-compatibility/2006" xmlns:m="http://schemas.openxmlformats.org/officeDocument/2006/math" xmlns:aink="http://schemas.microsoft.com/office/drawing/2016/ink" xmlns:am3d="http://schemas.microsoft.com/office/drawing/2017/model3d" xmlns:oel="http://schemas.microsoft.com/office/2019/extlst" xmlns:r="http://schemas.openxmlformats.org/officeDocument/2006/relationships" xmlns:wp14="http://schemas.microsoft.com/office/word/2010/wordprocessingDrawing" xmlns:wp="http://schemas.openxmlformats.org/drawingml/2006/wordprocessingDrawing" xmlns:wpg="http://schemas.microsoft.com/office/word/2010/wordprocessingGroup" xmlns:wpi="http://schemas.microsoft.com/office/word/2010/wordprocessingInk" xmlns:wps="http://schemas.microsoft.com/office/word/2010/wordprocessingShape" xmlns:o="urn:schemas-microsoft-com:office:office" xmlns:v="urn:schemas-microsoft-com:vml" xmlns:w10="urn:schemas-microsoft-com:office:word" xmlns:w="http://schemas.openxmlformats.org/wordprocessingml/2006/main" xmlns:w14="http://schemas.microsoft.com/office/word/2010/wordml" xmlns:w15="http://schemas.microsoft.com/office/word/2012/wordml" xmlns:w16cex="http://schemas.microsoft.com/office/word/2018/wordml/cex" xmlns:w16cid="http://schemas.microsoft.com/office/word/2016/wordml/cid" xmlns:w16="http://schemas.microsoft.com/office/word/2018/wordml" xmlns:w16sdtdh="http://schemas.microsoft.com/office/word/2020/wordml/sdtdatahash" xmlns:w16sdtfl="http://schemas.microsoft.com/office/word/2024/wordml/sdtformatlock" xmlns:w16se="http://schemas.microsoft.com/office/word/2015/wordml/symex" xmlns:w16du="http://schemas.microsoft.com/office/word/2023/wordml/word16du" xmlns:wne="http://schemas.microsoft.com/office/word/2006/wordml" mc:Ignorable="w14 w15 w16se w16cid w16 w16cex w16sdtdh w16sdtfl w16du wp14">
+  <w:p>
+    <w:pPr>
+      <w:pStyle w:val="Footer"/>
+    </w:pPr>
+  </w:p>
+</w:ftr>
+</file>
+
+<file path=word/footer3.xml><?xml version="1.0" encoding="utf-8"?>
+<w:ftr xmlns:wpc="http://schemas.microsoft.com/office/word/2010/wordprocessingCanvas" xmlns:cx="http://schemas.microsoft.com/office/drawing/2014/chartex" xmlns:cx1="http://schemas.microsoft.com/office/drawing/2015/9/8/chartex" xmlns:cx2="http://schemas.microsoft.com/office/drawing/2015/10/21/chartex" xmlns:cx3="http://schemas.microsoft.com/office/drawing/2016/5/9/chartex" xmlns:cx4="http://schemas.microsoft.com/office/drawing/2016/5/10/chartex" xmlns:cx5="http://schemas.microsoft.com/office/drawing/2016/5/11/chartex" xmlns:cx6="http://schemas.microsoft.com/office/drawing/2016/5/12/chartex" xmlns:cx7="http://schemas.microsoft.com/office/drawing/2016/5/13/chartex" xmlns:cx8="http://schemas.microsoft.com/office/drawing/2016/5/14/chartex" xmlns:mc="http://schemas.openxmlformats.org/markup-compatibility/2006" xmlns:m="http://schemas.openxmlformats.org/officeDocument/2006/math" xmlns:aink="http://schemas.microsoft.com/office/drawing/2016/ink" xmlns:am3d="http://schemas.microsoft.com/office/drawing/2017/model3d" xmlns:oel="http://schemas.microsoft.com/office/2019/extlst" xmlns:r="http://schemas.openxmlformats.org/officeDocument/2006/relationships" xmlns:wp14="http://schemas.microsoft.com/office/word/2010/wordprocessingDrawing" xmlns:wp="http://schemas.openxmlformats.org/drawingml/2006/wordprocessingDrawing" xmlns:wpg="http://schemas.microsoft.com/office/word/2010/wordprocessingGroup" xmlns:wpi="http://schemas.microsoft.com/office/word/2010/wordprocessingInk" xmlns:wps="http://schemas.microsoft.com/office/word/2010/wordprocessingShape" xmlns:o="urn:schemas-microsoft-com:office:office" xmlns:v="urn:schemas-microsoft-com:vml" xmlns:w10="urn:schemas-microsoft-com:office:word" xmlns:w="http://schemas.openxmlformats.org/wordprocessingml/2006/main" xmlns:w14="http://schemas.microsoft.com/office/word/2010/wordml" xmlns:w15="http://schemas.microsoft.com/office/word/2012/wordml" xmlns:w16cex="http://schemas.microsoft.com/office/word/2018/wordml/cex" xmlns:w16cid="http://schemas.microsoft.com/office/word/2016/wordml/cid" xmlns:w16="http://schemas.microsoft.com/office/word/2018/wordml" xmlns:w16sdtdh="http://schemas.microsoft.com/office/word/2020/wordml/sdtdatahash" xmlns:w16sdtfl="http://schemas.microsoft.com/office/word/2024/wordml/sdtformatlock" xmlns:w16se="http://schemas.microsoft.com/office/word/2015/wordml/symex" xmlns:w16du="http://schemas.microsoft.com/office/word/2023/wordml/word16du" xmlns:wne="http://schemas.microsoft.com/office/word/2006/wordml" mc:Ignorable="w14 w15 w16se w16cid w16 w16cex w16sdtdh w16sdtfl w16du wp14">
+  <w:p>
+    <w:pPr>
+      <w:pStyle w:val="Footer"/>
+    </w:pPr>
+  </w:p>
+</w:ftr>
+</file>
+
 <file path=word/footnotes.xml><?xml version="1.0" encoding="utf-8"?>
-<w:footnotes xmlns:wpc="http://schemas.microsoft.com/office/word/2010/wordprocessingCanvas" xmlns:cx="http://schemas.microsoft.com/office/drawing/2014/chartex" xmlns:cx1="http://schemas.microsoft.com/office/drawing/2015/9/8/chartex" xmlns:cx2="http://schemas.microsoft.com/office/drawing/2015/10/21/chartex" xmlns:cx3="http://schemas.microsoft.com/office/drawing/2016/5/9/chartex" xmlns:cx4="http://schemas.microsoft.com/office/drawing/2016/5/10/chartex" xmlns:cx5="http://schemas.microsoft.com/office/drawing/2016/5/11/chartex" xmlns:cx6="http://schemas.microsoft.com/office/drawing/2016/5/12/chartex" xmlns:cx7="http://schemas.microsoft.com/office/drawing/2016/5/13/chartex" xmlns:cx8="http://schemas.microsoft.com/office/drawing/2016/5/14/chartex" xmlns:mc="http://schemas.openxmlformats.org/markup-compatibility/2006" xmlns:aink="http://schemas.microsoft.com/office/drawing/2016/ink" xmlns:am3d="http://schemas.microsoft.com/office/drawing/2017/model3d" xmlns:o="urn:schemas-microsoft-com:office:office" xmlns:r="http://schemas.openxmlformats.org/officeDocument/2006/relationships" xmlns:m="http://schemas.openxmlformats.org/officeDocument/2006/math" xmlns:v="urn:schemas-microsoft-com:vml" xmlns:wp14="http://schemas.microsoft.com/office/word/2010/wordprocessingDrawing" xmlns:wp="http://schemas.openxmlformats.org/drawingml/2006/wordprocessingDrawing" xmlns:w10="urn:schemas-microsoft-com:office:word" xmlns:w="http://schemas.openxmlformats.org/wordprocessingml/2006/main" xmlns:w14="http://schemas.microsoft.com/office/word/2010/wordml" xmlns:w15="http://schemas.microsoft.com/office/word/2012/wordml" xmlns:w16cid="http://schemas.microsoft.com/office/word/2016/wordml/cid" xmlns:w16se="http://schemas.microsoft.com/office/word/2015/wordml/symex" xmlns:wpg="http://schemas.microsoft.com/office/word/2010/wordprocessingGroup" xmlns:wpi="http://schemas.microsoft.com/office/word/2010/wordprocessingInk" xmlns:wne="http://schemas.microsoft.com/office/word/2006/wordml" xmlns:wps="http://schemas.microsoft.com/office/word/2010/wordprocessingShape" mc:Ignorable="w14 w15 w16se w16cid wp14">
+<w:footnotes xmlns:wpc="http://schemas.microsoft.com/office/word/2010/wordprocessingCanvas" xmlns:cx="http://schemas.microsoft.com/office/drawing/2014/chartex" xmlns:cx1="http://schemas.microsoft.com/office/drawing/2015/9/8/chartex" xmlns:cx2="http://schemas.microsoft.com/office/drawing/2015/10/21/chartex" xmlns:cx3="http://schemas.microsoft.com/office/drawing/2016/5/9/chartex" xmlns:cx4="http://schemas.microsoft.com/office/drawing/2016/5/10/chartex" xmlns:cx5="http://schemas.microsoft.com/office/drawing/2016/5/11/chartex" xmlns:cx6="http://schemas.microsoft.com/office/drawing/2016/5/12/chartex" xmlns:cx7="http://schemas.microsoft.com/office/drawing/2016/5/13/chartex" xmlns:cx8="http://schemas.microsoft.com/office/drawing/2016/5/14/chartex" xmlns:mc="http://schemas.openxmlformats.org/markup-compatibility/2006" xmlns:m="http://schemas.openxmlformats.org/officeDocument/2006/math" xmlns:aink="http://schemas.microsoft.com/office/drawing/2016/ink" xmlns:am3d="http://schemas.microsoft.com/office/drawing/2017/model3d" xmlns:oel="http://schemas.microsoft.com/office/2019/extlst" xmlns:r="http://schemas.openxmlformats.org/officeDocument/2006/relationships" xmlns:wp14="http://schemas.microsoft.com/office/word/2010/wordprocessingDrawing" xmlns:wp="http://schemas.openxmlformats.org/drawingml/2006/wordprocessingDrawing" xmlns:wpg="http://schemas.microsoft.com/office/word/2010/wordprocessingGroup" xmlns:wpi="http://schemas.microsoft.com/office/word/2010/wordprocessingInk" xmlns:wps="http://schemas.microsoft.com/office/word/2010/wordprocessingShape" xmlns:o="urn:schemas-microsoft-com:office:office" xmlns:v="urn:schemas-microsoft-com:vml" xmlns:w10="urn:schemas-microsoft-com:office:word" xmlns:w="http://schemas.openxmlformats.org/wordprocessingml/2006/main" xmlns:w14="http://schemas.microsoft.com/office/word/2010/wordml" xmlns:w15="http://schemas.microsoft.com/office/word/2012/wordml" xmlns:w16cex="http://schemas.microsoft.com/office/word/2018/wordml/cex" xmlns:w16cid="http://schemas.microsoft.com/office/word/2016/wordml/cid" xmlns:w16="http://schemas.microsoft.com/office/word/2018/wordml" xmlns:w16sdtdh="http://schemas.microsoft.com/office/word/2020/wordml/sdtdatahash" xmlns:w16sdtfl="http://schemas.microsoft.com/office/word/2024/wordml/sdtformatlock" xmlns:w16se="http://schemas.microsoft.com/office/word/2015/wordml/symex" xmlns:w16du="http://schemas.microsoft.com/office/word/2023/wordml/word16du" xmlns:wne="http://schemas.microsoft.com/office/word/2006/wordml" mc:Ignorable="w14 w15 w16se w16cid w16 w16cex w16sdtdh w16sdtfl w16du wp14">
   <w:footnote w:type="separator" w:id="-1">
     <w:p>
       <w:pPr>
@@ -760,8 +397,38 @@
 </w:footnotes>
 </file>
 
+<file path=word/header1.xml><?xml version="1.0" encoding="utf-8"?>
+<w:hdr xmlns:wpc="http://schemas.microsoft.com/office/word/2010/wordprocessingCanvas" xmlns:cx="http://schemas.microsoft.com/office/drawing/2014/chartex" xmlns:cx1="http://schemas.microsoft.com/office/drawing/2015/9/8/chartex" xmlns:cx2="http://schemas.microsoft.com/office/drawing/2015/10/21/chartex" xmlns:cx3="http://schemas.microsoft.com/office/drawing/2016/5/9/chartex" xmlns:cx4="http://schemas.microsoft.com/office/drawing/2016/5/10/chartex" xmlns:cx5="http://schemas.microsoft.com/office/drawing/2016/5/11/chartex" xmlns:cx6="http://schemas.microsoft.com/office/drawing/2016/5/12/chartex" xmlns:cx7="http://schemas.microsoft.com/office/drawing/2016/5/13/chartex" xmlns:cx8="http://schemas.microsoft.com/office/drawing/2016/5/14/chartex" xmlns:mc="http://schemas.openxmlformats.org/markup-compatibility/2006" xmlns:m="http://schemas.openxmlformats.org/officeDocument/2006/math" xmlns:aink="http://schemas.microsoft.com/office/drawing/2016/ink" xmlns:am3d="http://schemas.microsoft.com/office/drawing/2017/model3d" xmlns:oel="http://schemas.microsoft.com/office/2019/extlst" xmlns:r="http://schemas.openxmlformats.org/officeDocument/2006/relationships" xmlns:wp14="http://schemas.microsoft.com/office/word/2010/wordprocessingDrawing" xmlns:wp="http://schemas.openxmlformats.org/drawingml/2006/wordprocessingDrawing" xmlns:wpg="http://schemas.microsoft.com/office/word/2010/wordprocessingGroup" xmlns:wpi="http://schemas.microsoft.com/office/word/2010/wordprocessingInk" xmlns:wps="http://schemas.microsoft.com/office/word/2010/wordprocessingShape" xmlns:o="urn:schemas-microsoft-com:office:office" xmlns:v="urn:schemas-microsoft-com:vml" xmlns:w10="urn:schemas-microsoft-com:office:word" xmlns:w="http://schemas.openxmlformats.org/wordprocessingml/2006/main" xmlns:w14="http://schemas.microsoft.com/office/word/2010/wordml" xmlns:w15="http://schemas.microsoft.com/office/word/2012/wordml" xmlns:w16cex="http://schemas.microsoft.com/office/word/2018/wordml/cex" xmlns:w16cid="http://schemas.microsoft.com/office/word/2016/wordml/cid" xmlns:w16="http://schemas.microsoft.com/office/word/2018/wordml" xmlns:w16sdtdh="http://schemas.microsoft.com/office/word/2020/wordml/sdtdatahash" xmlns:w16sdtfl="http://schemas.microsoft.com/office/word/2024/wordml/sdtformatlock" xmlns:w16se="http://schemas.microsoft.com/office/word/2015/wordml/symex" xmlns:w16du="http://schemas.microsoft.com/office/word/2023/wordml/word16du" xmlns:wne="http://schemas.microsoft.com/office/word/2006/wordml" mc:Ignorable="w14 w15 w16se w16cid w16 w16cex w16sdtdh w16sdtfl w16du wp14">
+  <w:p>
+    <w:pPr>
+      <w:pStyle w:val="Header"/>
+    </w:pPr>
+  </w:p>
+</w:hdr>
+</file>
+
+<file path=word/header2.xml><?xml version="1.0" encoding="utf-8"?>
+<w:hdr xmlns:wpc="http://schemas.microsoft.com/office/word/2010/wordprocessingCanvas" xmlns:cx="http://schemas.microsoft.com/office/drawing/2014/chartex" xmlns:cx1="http://schemas.microsoft.com/office/drawing/2015/9/8/chartex" xmlns:cx2="http://schemas.microsoft.com/office/drawing/2015/10/21/chartex" xmlns:cx3="http://schemas.microsoft.com/office/drawing/2016/5/9/chartex" xmlns:cx4="http://schemas.microsoft.com/office/drawing/2016/5/10/chartex" xmlns:cx5="http://schemas.microsoft.com/office/drawing/2016/5/11/chartex" xmlns:cx6="http://schemas.microsoft.com/office/drawing/2016/5/12/chartex" xmlns:cx7="http://schemas.microsoft.com/office/drawing/2016/5/13/chartex" xmlns:cx8="http://schemas.microsoft.com/office/drawing/2016/5/14/chartex" xmlns:mc="http://schemas.openxmlformats.org/markup-compatibility/2006" xmlns:m="http://schemas.openxmlformats.org/officeDocument/2006/math" xmlns:aink="http://schemas.microsoft.com/office/drawing/2016/ink" xmlns:am3d="http://schemas.microsoft.com/office/drawing/2017/model3d" xmlns:oel="http://schemas.microsoft.com/office/2019/extlst" xmlns:r="http://schemas.openxmlformats.org/officeDocument/2006/relationships" xmlns:wp14="http://schemas.microsoft.com/office/word/2010/wordprocessingDrawing" xmlns:wp="http://schemas.openxmlformats.org/drawingml/2006/wordprocessingDrawing" xmlns:wpg="http://schemas.microsoft.com/office/word/2010/wordprocessingGroup" xmlns:wpi="http://schemas.microsoft.com/office/word/2010/wordprocessingInk" xmlns:wps="http://schemas.microsoft.com/office/word/2010/wordprocessingShape" xmlns:o="urn:schemas-microsoft-com:office:office" xmlns:v="urn:schemas-microsoft-com:vml" xmlns:w10="urn:schemas-microsoft-com:office:word" xmlns:w="http://schemas.openxmlformats.org/wordprocessingml/2006/main" xmlns:w14="http://schemas.microsoft.com/office/word/2010/wordml" xmlns:w15="http://schemas.microsoft.com/office/word/2012/wordml" xmlns:w16cex="http://schemas.microsoft.com/office/word/2018/wordml/cex" xmlns:w16cid="http://schemas.microsoft.com/office/word/2016/wordml/cid" xmlns:w16="http://schemas.microsoft.com/office/word/2018/wordml" xmlns:w16sdtdh="http://schemas.microsoft.com/office/word/2020/wordml/sdtdatahash" xmlns:w16sdtfl="http://schemas.microsoft.com/office/word/2024/wordml/sdtformatlock" xmlns:w16se="http://schemas.microsoft.com/office/word/2015/wordml/symex" xmlns:w16du="http://schemas.microsoft.com/office/word/2023/wordml/word16du" xmlns:wne="http://schemas.microsoft.com/office/word/2006/wordml" mc:Ignorable="w14 w15 w16se w16cid w16 w16cex w16sdtdh w16sdtfl w16du wp14">
+  <w:p>
+    <w:pPr>
+      <w:pStyle w:val="Header"/>
+    </w:pPr>
+  </w:p>
+</w:hdr>
+</file>
+
+<file path=word/header3.xml><?xml version="1.0" encoding="utf-8"?>
+<w:hdr xmlns:wpc="http://schemas.microsoft.com/office/word/2010/wordprocessingCanvas" xmlns:cx="http://schemas.microsoft.com/office/drawing/2014/chartex" xmlns:cx1="http://schemas.microsoft.com/office/drawing/2015/9/8/chartex" xmlns:cx2="http://schemas.microsoft.com/office/drawing/2015/10/21/chartex" xmlns:cx3="http://schemas.microsoft.com/office/drawing/2016/5/9/chartex" xmlns:cx4="http://schemas.microsoft.com/office/drawing/2016/5/10/chartex" xmlns:cx5="http://schemas.microsoft.com/office/drawing/2016/5/11/chartex" xmlns:cx6="http://schemas.microsoft.com/office/drawing/2016/5/12/chartex" xmlns:cx7="http://schemas.microsoft.com/office/drawing/2016/5/13/chartex" xmlns:cx8="http://schemas.microsoft.com/office/drawing/2016/5/14/chartex" xmlns:mc="http://schemas.openxmlformats.org/markup-compatibility/2006" xmlns:m="http://schemas.openxmlformats.org/officeDocument/2006/math" xmlns:aink="http://schemas.microsoft.com/office/drawing/2016/ink" xmlns:am3d="http://schemas.microsoft.com/office/drawing/2017/model3d" xmlns:oel="http://schemas.microsoft.com/office/2019/extlst" xmlns:r="http://schemas.openxmlformats.org/officeDocument/2006/relationships" xmlns:wp14="http://schemas.microsoft.com/office/word/2010/wordprocessingDrawing" xmlns:wp="http://schemas.openxmlformats.org/drawingml/2006/wordprocessingDrawing" xmlns:wpg="http://schemas.microsoft.com/office/word/2010/wordprocessingGroup" xmlns:wpi="http://schemas.microsoft.com/office/word/2010/wordprocessingInk" xmlns:wps="http://schemas.microsoft.com/office/word/2010/wordprocessingShape" xmlns:o="urn:schemas-microsoft-com:office:office" xmlns:v="urn:schemas-microsoft-com:vml" xmlns:w10="urn:schemas-microsoft-com:office:word" xmlns:w="http://schemas.openxmlformats.org/wordprocessingml/2006/main" xmlns:w14="http://schemas.microsoft.com/office/word/2010/wordml" xmlns:w15="http://schemas.microsoft.com/office/word/2012/wordml" xmlns:w16cex="http://schemas.microsoft.com/office/word/2018/wordml/cex" xmlns:w16cid="http://schemas.microsoft.com/office/word/2016/wordml/cid" xmlns:w16="http://schemas.microsoft.com/office/word/2018/wordml" xmlns:w16sdtdh="http://schemas.microsoft.com/office/word/2020/wordml/sdtdatahash" xmlns:w16sdtfl="http://schemas.microsoft.com/office/word/2024/wordml/sdtformatlock" xmlns:w16se="http://schemas.microsoft.com/office/word/2015/wordml/symex" xmlns:w16du="http://schemas.microsoft.com/office/word/2023/wordml/word16du" xmlns:wne="http://schemas.microsoft.com/office/word/2006/wordml" mc:Ignorable="w14 w15 w16se w16cid w16 w16cex w16sdtdh w16sdtfl w16du wp14">
+  <w:p>
+    <w:pPr>
+      <w:pStyle w:val="Header"/>
+    </w:pPr>
+  </w:p>
+</w:hdr>
+</file>
+
 <file path=word/numbering.xml><?xml version="1.0" encoding="utf-8"?>
-<w:numbering xmlns:wpc="http://schemas.microsoft.com/office/word/2010/wordprocessingCanvas" xmlns:cx="http://schemas.microsoft.com/office/drawing/2014/chartex" xmlns:cx1="http://schemas.microsoft.com/office/drawing/2015/9/8/chartex" xmlns:cx2="http://schemas.microsoft.com/office/drawing/2015/10/21/chartex" xmlns:cx3="http://schemas.microsoft.com/office/drawing/2016/5/9/chartex" xmlns:cx4="http://schemas.microsoft.com/office/drawing/2016/5/10/chartex" xmlns:cx5="http://schemas.microsoft.com/office/drawing/2016/5/11/chartex" xmlns:cx6="http://schemas.microsoft.com/office/drawing/2016/5/12/chartex" xmlns:cx7="http://schemas.microsoft.com/office/drawing/2016/5/13/chartex" xmlns:cx8="http://schemas.microsoft.com/office/drawing/2016/5/14/chartex" xmlns:mc="http://schemas.openxmlformats.org/markup-compatibility/2006" xmlns:aink="http://schemas.microsoft.com/office/drawing/2016/ink" xmlns:am3d="http://schemas.microsoft.com/office/drawing/2017/model3d" xmlns:o="urn:schemas-microsoft-com:office:office" xmlns:r="http://schemas.openxmlformats.org/officeDocument/2006/relationships" xmlns:m="http://schemas.openxmlformats.org/officeDocument/2006/math" xmlns:v="urn:schemas-microsoft-com:vml" xmlns:wp14="http://schemas.microsoft.com/office/word/2010/wordprocessingDrawing" xmlns:wp="http://schemas.openxmlformats.org/drawingml/2006/wordprocessingDrawing" xmlns:w10="urn:schemas-microsoft-com:office:word" xmlns:w="http://schemas.openxmlformats.org/wordprocessingml/2006/main" xmlns:w14="http://schemas.microsoft.com/office/word/2010/wordml" xmlns:w15="http://schemas.microsoft.com/office/word/2012/wordml" xmlns:w16cid="http://schemas.microsoft.com/office/word/2016/wordml/cid" xmlns:w16se="http://schemas.microsoft.com/office/word/2015/wordml/symex" xmlns:wpg="http://schemas.microsoft.com/office/word/2010/wordprocessingGroup" xmlns:wpi="http://schemas.microsoft.com/office/word/2010/wordprocessingInk" xmlns:wne="http://schemas.microsoft.com/office/word/2006/wordml" xmlns:wps="http://schemas.microsoft.com/office/word/2010/wordprocessingShape" mc:Ignorable="w14 w15 w16se w16cid wp14">
+<w:numbering xmlns:wpc="http://schemas.microsoft.com/office/word/2010/wordprocessingCanvas" xmlns:cx="http://schemas.microsoft.com/office/drawing/2014/chartex" xmlns:cx1="http://schemas.microsoft.com/office/drawing/2015/9/8/chartex" xmlns:cx2="http://schemas.microsoft.com/office/drawing/2015/10/21/chartex" xmlns:cx3="http://schemas.microsoft.com/office/drawing/2016/5/9/chartex" xmlns:cx4="http://schemas.microsoft.com/office/drawing/2016/5/10/chartex" xmlns:cx5="http://schemas.microsoft.com/office/drawing/2016/5/11/chartex" xmlns:cx6="http://schemas.microsoft.com/office/drawing/2016/5/12/chartex" xmlns:cx7="http://schemas.microsoft.com/office/drawing/2016/5/13/chartex" xmlns:cx8="http://schemas.microsoft.com/office/drawing/2016/5/14/chartex" xmlns:mc="http://schemas.openxmlformats.org/markup-compatibility/2006" xmlns:m="http://schemas.openxmlformats.org/officeDocument/2006/math" xmlns:aink="http://schemas.microsoft.com/office/drawing/2016/ink" xmlns:am3d="http://schemas.microsoft.com/office/drawing/2017/model3d" xmlns:oel="http://schemas.microsoft.com/office/2019/extlst" xmlns:r="http://schemas.openxmlformats.org/officeDocument/2006/relationships" xmlns:wp14="http://schemas.microsoft.com/office/word/2010/wordprocessingDrawing" xmlns:wp="http://schemas.openxmlformats.org/drawingml/2006/wordprocessingDrawing" xmlns:wpg="http://schemas.microsoft.com/office/word/2010/wordprocessingGroup" xmlns:wpi="http://schemas.microsoft.com/office/word/2010/wordprocessingInk" xmlns:wps="http://schemas.microsoft.com/office/word/2010/wordprocessingShape" xmlns:o="urn:schemas-microsoft-com:office:office" xmlns:v="urn:schemas-microsoft-com:vml" xmlns:w10="urn:schemas-microsoft-com:office:word" xmlns:w="http://schemas.openxmlformats.org/wordprocessingml/2006/main" xmlns:w14="http://schemas.microsoft.com/office/word/2010/wordml" xmlns:w15="http://schemas.microsoft.com/office/word/2012/wordml" xmlns:w16cex="http://schemas.microsoft.com/office/word/2018/wordml/cex" xmlns:w16cid="http://schemas.microsoft.com/office/word/2016/wordml/cid" xmlns:w16="http://schemas.microsoft.com/office/word/2018/wordml" xmlns:w16sdtdh="http://schemas.microsoft.com/office/word/2020/wordml/sdtdatahash" xmlns:w16sdtfl="http://schemas.microsoft.com/office/word/2024/wordml/sdtformatlock" xmlns:w16se="http://schemas.microsoft.com/office/word/2015/wordml/symex" xmlns:w16du="http://schemas.microsoft.com/office/word/2023/wordml/word16du" xmlns:wne="http://schemas.microsoft.com/office/word/2006/wordml" mc:Ignorable="w14 w15 w16se w16cid w16 w16cex w16sdtdh w16sdtfl w16du wp14">
   <w:abstractNum w:abstractNumId="0" w15:restartNumberingAfterBreak="0">
     <w:nsid w:val="13F848C7"/>
     <w:multiLevelType w:val="hybridMultilevel"/>
@@ -1745,38 +1412,131 @@
       </w:rPr>
     </w:lvl>
   </w:abstractNum>
-  <w:num w:numId="1">
+  <w:abstractNum w:abstractNumId="9" w15:restartNumberingAfterBreak="0">
+    <w:nsid w:val="7F680190"/>
+    <w:multiLevelType w:val="hybridMultilevel"/>
+    <w:tmpl w:val="924276BA"/>
+    <w:lvl w:ilvl="0" w:tplc="39FE331C">
+      <w:start w:val="1"/>
+      <w:numFmt w:val="decimal"/>
+      <w:lvlText w:val="%1."/>
+      <w:lvlJc w:val="left"/>
+      <w:pPr>
+        <w:ind w:left="360" w:hanging="360"/>
+      </w:pPr>
+      <w:rPr>
+        <w:b/>
+        <w:bCs/>
+      </w:rPr>
+    </w:lvl>
+    <w:lvl w:ilvl="1" w:tplc="04090019" w:tentative="1">
+      <w:start w:val="1"/>
+      <w:numFmt w:val="lowerLetter"/>
+      <w:lvlText w:val="%2."/>
+      <w:lvlJc w:val="left"/>
+      <w:pPr>
+        <w:ind w:left="1080" w:hanging="360"/>
+      </w:pPr>
+    </w:lvl>
+    <w:lvl w:ilvl="2" w:tplc="0409001B" w:tentative="1">
+      <w:start w:val="1"/>
+      <w:numFmt w:val="lowerRoman"/>
+      <w:lvlText w:val="%3."/>
+      <w:lvlJc w:val="right"/>
+      <w:pPr>
+        <w:ind w:left="1800" w:hanging="180"/>
+      </w:pPr>
+    </w:lvl>
+    <w:lvl w:ilvl="3" w:tplc="0409000F" w:tentative="1">
+      <w:start w:val="1"/>
+      <w:numFmt w:val="decimal"/>
+      <w:lvlText w:val="%4."/>
+      <w:lvlJc w:val="left"/>
+      <w:pPr>
+        <w:ind w:left="2520" w:hanging="360"/>
+      </w:pPr>
+    </w:lvl>
+    <w:lvl w:ilvl="4" w:tplc="04090019" w:tentative="1">
+      <w:start w:val="1"/>
+      <w:numFmt w:val="lowerLetter"/>
+      <w:lvlText w:val="%5."/>
+      <w:lvlJc w:val="left"/>
+      <w:pPr>
+        <w:ind w:left="3240" w:hanging="360"/>
+      </w:pPr>
+    </w:lvl>
+    <w:lvl w:ilvl="5" w:tplc="0409001B" w:tentative="1">
+      <w:start w:val="1"/>
+      <w:numFmt w:val="lowerRoman"/>
+      <w:lvlText w:val="%6."/>
+      <w:lvlJc w:val="right"/>
+      <w:pPr>
+        <w:ind w:left="3960" w:hanging="180"/>
+      </w:pPr>
+    </w:lvl>
+    <w:lvl w:ilvl="6" w:tplc="0409000F" w:tentative="1">
+      <w:start w:val="1"/>
+      <w:numFmt w:val="decimal"/>
+      <w:lvlText w:val="%7."/>
+      <w:lvlJc w:val="left"/>
+      <w:pPr>
+        <w:ind w:left="4680" w:hanging="360"/>
+      </w:pPr>
+    </w:lvl>
+    <w:lvl w:ilvl="7" w:tplc="04090019" w:tentative="1">
+      <w:start w:val="1"/>
+      <w:numFmt w:val="lowerLetter"/>
+      <w:lvlText w:val="%8."/>
+      <w:lvlJc w:val="left"/>
+      <w:pPr>
+        <w:ind w:left="5400" w:hanging="360"/>
+      </w:pPr>
+    </w:lvl>
+    <w:lvl w:ilvl="8" w:tplc="0409001B" w:tentative="1">
+      <w:start w:val="1"/>
+      <w:numFmt w:val="lowerRoman"/>
+      <w:lvlText w:val="%9."/>
+      <w:lvlJc w:val="right"/>
+      <w:pPr>
+        <w:ind w:left="6120" w:hanging="180"/>
+      </w:pPr>
+    </w:lvl>
+  </w:abstractNum>
+  <w:num w:numId="1" w16cid:durableId="775760174">
     <w:abstractNumId w:val="5"/>
   </w:num>
-  <w:num w:numId="2">
+  <w:num w:numId="2" w16cid:durableId="2103338215">
     <w:abstractNumId w:val="8"/>
   </w:num>
-  <w:num w:numId="3">
+  <w:num w:numId="3" w16cid:durableId="1780955862">
     <w:abstractNumId w:val="1"/>
   </w:num>
-  <w:num w:numId="4">
+  <w:num w:numId="4" w16cid:durableId="1151603996">
     <w:abstractNumId w:val="3"/>
   </w:num>
-  <w:num w:numId="5">
+  <w:num w:numId="5" w16cid:durableId="394549212">
     <w:abstractNumId w:val="7"/>
   </w:num>
-  <w:num w:numId="6">
+  <w:num w:numId="6" w16cid:durableId="1175656920">
     <w:abstractNumId w:val="4"/>
   </w:num>
-  <w:num w:numId="7">
+  <w:num w:numId="7" w16cid:durableId="1448889051">
     <w:abstractNumId w:val="0"/>
   </w:num>
-  <w:num w:numId="8">
+  <w:num w:numId="8" w16cid:durableId="662054328">
     <w:abstractNumId w:val="2"/>
   </w:num>
-  <w:num w:numId="9">
+  <w:num w:numId="9" w16cid:durableId="28380477">
     <w:abstractNumId w:val="6"/>
+  </w:num>
+  <w:num w:numId="10" w16cid:durableId="581917544">
+    <w:abstractNumId w:val="9"/>
   </w:num>
 </w:numbering>
 </file>
 
 <file path=word/styles.xml><?xml version="1.0" encoding="utf-8"?>
-<w:styles xmlns:mc="http://schemas.openxmlformats.org/markup-compatibility/2006" xmlns:r="http://schemas.openxmlformats.org/officeDocument/2006/relationships" xmlns:w="http://schemas.openxmlformats.org/wordprocessingml/2006/main" xmlns:w14="http://schemas.microsoft.com/office/word/2010/wordml" xmlns:w15="http://schemas.microsoft.com/office/word/2012/wordml" xmlns:w16cid="http://schemas.microsoft.com/office/word/2016/wordml/cid" xmlns:w16se="http://schemas.microsoft.com/office/word/2015/wordml/symex" mc:Ignorable="w14 w15 w16se w16cid">
+<w:styles xmlns:mc="http://schemas.openxmlformats.org/markup-compatibility/2006" xmlns:r="http://schemas.openxmlformats.org/officeDocument/2006/relationships" xmlns:w="http://schemas.openxmlformats.org/wordprocessingml/2006/main" xmlns:w14="http://schemas.microsoft.com/office/word/2010/wordml" xmlns:w15="http://schemas.microsoft.com/office/word/2012/wordml" xmlns:w16cex="http://schemas.microsoft.com/office/word/2018/wordml/cex" xmlns:w16cid="http://schemas.microsoft.com/office/word/2016/wordml/cid" xmlns:w16="http://schemas.microsoft.com/office/word/2018/wordml" xmlns:w16sdtdh="http://schemas.microsoft.com/office/word/2020/wordml/sdtdatahash" xmlns:w16sdtfl="http://schemas.microsoft.com/office/word/2024/wordml/sdtformatlock" xmlns:w16se="http://schemas.microsoft.com/office/word/2015/wordml/symex" xmlns:w16du="http://schemas.microsoft.com/office/word/2023/wordml/word16du" mc:Ignorable="w14 w15 w16se w16cid w16 w16cex w16sdtdh w16sdtfl w16du">
   <w:docDefaults>
     <w:rPrDefault>
       <w:rPr>
@@ -1787,7 +1547,7 @@
     </w:rPrDefault>
     <w:pPrDefault/>
   </w:docDefaults>
-  <w:latentStyles w:defLockedState="0" w:defUIPriority="99" w:defSemiHidden="0" w:defUnhideWhenUsed="0" w:defQFormat="0" w:count="375">
+  <w:latentStyles w:defLockedState="0" w:defUIPriority="99" w:defSemiHidden="0" w:defUnhideWhenUsed="0" w:defQFormat="0" w:count="376">
     <w:lsdException w:name="Normal" w:uiPriority="0" w:qFormat="1"/>
     <w:lsdException w:name="heading 1" w:uiPriority="9" w:qFormat="1"/>
     <w:lsdException w:name="heading 2" w:semiHidden="1" w:uiPriority="9" w:unhideWhenUsed="1" w:qFormat="1"/>
@@ -2163,6 +1923,7 @@
     <w:lsdException w:name="Smart Hyperlink" w:semiHidden="1" w:unhideWhenUsed="1"/>
     <w:lsdException w:name="Hashtag" w:semiHidden="1" w:unhideWhenUsed="1"/>
     <w:lsdException w:name="Unresolved Mention" w:semiHidden="1" w:unhideWhenUsed="1"/>
+    <w:lsdException w:name="Smart Link" w:semiHidden="1" w:unhideWhenUsed="1"/>
   </w:latentStyles>
   <w:style w:type="paragraph" w:default="1" w:styleId="Normal">
     <w:name w:val="Normal"/>
@@ -2840,12 +2601,12 @@
     <w:qFormat/>
     <w:rsid w:val="00F47A36"/>
     <w:pPr>
-      <w:jc w:val="center"/>
-      <w:shd w:val="clear" w:color="auto" w:fill="17406D"/>
       <w:pBdr>
         <w:top w:val="single" w:sz="48" w:space="1" w:color="17406D"/>
         <w:bottom w:val="single" w:sz="48" w:space="1" w:color="17406D"/>
       </w:pBdr>
+      <w:shd w:val="clear" w:color="auto" w:fill="17406D"/>
+      <w:jc w:val="center"/>
     </w:pPr>
     <w:rPr>
       <w:rFonts w:asciiTheme="majorHAnsi" w:eastAsiaTheme="majorEastAsia" w:hAnsiTheme="majorHAnsi" w:cstheme="majorBidi"/>

</xml_diff>

<commit_message>
Fixed next steps document
</commit_message>
<xml_diff>
--- a/docassemble/NDPowerOfAttorneyForCareAndCustodyOfMinor/data/templates/nd_power_of_attorney_minor_short_form_v2_next_steps.docx
+++ b/docassemble/NDPowerOfAttorneyForCareAndCustodyOfMinor/data/templates/nd_power_of_attorney_minor_short_form_v2_next_steps.docx
@@ -54,7 +54,6 @@
         <w:t>your form.</w:t>
       </w:r>
     </w:p>
-    <w:p/>
     <w:p>
       <w:pPr>
         <w:sectPr>
@@ -83,7 +82,10 @@
       <w:bookmarkEnd w:id="0"/>
       <w:bookmarkEnd w:id="1"/>
       <w:r>
-        <w:t>What happens next?</w:t>
+        <w:t xml:space="preserve">What </w:t>
+      </w:r>
+      <w:r>
+        <w:t>you should do next:</w:t>
       </w:r>
     </w:p>
     <w:p>
@@ -95,7 +97,13 @@
         </w:numPr>
       </w:pPr>
       <w:r>
-        <w:t xml:space="preserve">Look over the forms below, one more time. Make sure everything is correct. </w:t>
+        <w:t xml:space="preserve">Look over the </w:t>
+      </w:r>
+      <w:r>
+        <w:t>form again</w:t>
+      </w:r>
+      <w:r>
+        <w:t xml:space="preserve">. Make sure everything is correct. </w:t>
       </w:r>
     </w:p>
     <w:p>
@@ -107,7 +115,28 @@
         </w:numPr>
       </w:pPr>
       <w:r>
-        <w:t>After completing the form, sign it with a notary or court clerk.</w:t>
+        <w:t>If you did not sign the form online</w:t>
+      </w:r>
+      <w:r>
+        <w:t xml:space="preserve">, </w:t>
+      </w:r>
+      <w:r>
+        <w:t xml:space="preserve">wait to sign it until you are </w:t>
+      </w:r>
+      <w:r>
+        <w:t>with a notary or court clerk.</w:t>
+      </w:r>
+    </w:p>
+    <w:p>
+      <w:pPr>
+        <w:pStyle w:val="ListParagraph"/>
+        <w:numPr>
+          <w:ilvl w:val="0"/>
+          <w:numId w:val="3"/>
+        </w:numPr>
+      </w:pPr>
+      <w:r>
+        <w:t>If you signed the form online with a notary or court clerk, you are done.</w:t>
       </w:r>
     </w:p>
     <w:p>
@@ -136,6 +165,16 @@
           </w14:textOutline>
         </w:rPr>
         <w:t>Give a copy to {{ attorney_in_fact[0] }}</w:t>
+      </w:r>
+      <w:r>
+        <w:rPr>
+          <w14:textOutline w14:w="9525" w14:cap="rnd" w14:cmpd="sng" w14:algn="ctr">
+            <w14:noFill/>
+            <w14:prstDash w14:val="solid"/>
+            <w14:bevel/>
+          </w14:textOutline>
+        </w:rPr>
+        <w:t>.</w:t>
       </w:r>
     </w:p>
     <w:p>
@@ -174,10 +213,8 @@
       <w:pPr>
         <w:pStyle w:val="Heading2"/>
       </w:pPr>
-      <w:bookmarkStart w:id="2" w:name="_7jbtnvplu76"/>
-      <w:bookmarkEnd w:id="2"/>
-      <w:r>
-        <w:t xml:space="preserve">What can </w:t>
+      <w:r>
+        <w:t xml:space="preserve">What </w:t>
       </w:r>
       <w:r>
         <w:rPr>
@@ -187,20 +224,10 @@
             <w14:bevel/>
           </w14:textOutline>
         </w:rPr>
-        <w:t>{{ attorney_in_fact[0] }}</w:t>
-      </w:r>
-      <w:r>
-        <w:rPr>
-          <w14:textOutline w14:w="9525" w14:cap="rnd" w14:cmpd="sng" w14:algn="ctr">
-            <w14:noFill/>
-            <w14:prstDash w14:val="solid"/>
-            <w14:bevel/>
-          </w14:textOutline>
-        </w:rPr>
-        <w:t xml:space="preserve"> </w:t>
-      </w:r>
-      <w:r>
-        <w:t>do?</w:t>
+        <w:t xml:space="preserve">{{ attorney_in_fact[0] }} </w:t>
+      </w:r>
+      <w:r>
+        <w:t>should do next:</w:t>
       </w:r>
     </w:p>
     <w:p>
@@ -212,7 +239,19 @@
         </w:numPr>
       </w:pPr>
       <w:r>
-        <w:t>{{ attorney_in_fact[0] }} can make the choices that you gave them when you filled out the form. They can care for your child(ren) in the ways you chose. They cannot consent to marriage or adoption.</w:t>
+        <w:t xml:space="preserve">{{ attorney_in_fact[0] }} can </w:t>
+      </w:r>
+      <w:r>
+        <w:t xml:space="preserve">now </w:t>
+      </w:r>
+      <w:r>
+        <w:t xml:space="preserve">make choices </w:t>
+      </w:r>
+      <w:r>
+        <w:t>for your child(ren)</w:t>
+      </w:r>
+      <w:r>
+        <w:t>. They can care for your child(ren) in the ways you chose. They cannot consent to marriage or adoption.</w:t>
       </w:r>
     </w:p>
     <w:p>
@@ -224,18 +263,41 @@
         </w:numPr>
       </w:pPr>
       <w:r>
-        <w:t>You can take back your powers at any time. If you want to take back your powers before the end date on the form, you can write a letter to the court.</w:t>
+        <w:t xml:space="preserve">{{ attorney_in_fact[0] }} </w:t>
+      </w:r>
+      <w:r>
+        <w:t>should keep a copy of the form. They may need to show it to your child(ren)’s school, doctors, or other places where decisions are made.</w:t>
       </w:r>
     </w:p>
     <w:p>
       <w:pPr>
         <w:pStyle w:val="Heading2"/>
+      </w:pPr>
+      <w:r>
+        <w:t>When does my delegation of powers end</w:t>
+      </w:r>
+      <w:r>
+        <w:t>?</w:t>
+      </w:r>
+    </w:p>
+    <w:p>
+      <w:pPr>
+        <w:pStyle w:val="NumberedList"/>
+        <w:ind w:left="360"/>
+      </w:pPr>
+      <w:r>
+        <w:t>You can take back your powers at any time. If you want to take back your powers before the end date on the form, you can write a letter to the court.</w:t>
+      </w:r>
+    </w:p>
+    <w:p>
+      <w:pPr>
+        <w:pStyle w:val="Heading2"/>
         <w:keepNext/>
       </w:pPr>
-      <w:bookmarkStart w:id="3" w:name="_jpvqkqfibwqh"/>
-      <w:bookmarkStart w:id="4" w:name="_wjzvjugefec1"/>
+      <w:bookmarkStart w:id="2" w:name="_jpvqkqfibwqh"/>
+      <w:bookmarkStart w:id="3" w:name="_wjzvjugefec1"/>
+      <w:bookmarkEnd w:id="2"/>
       <w:bookmarkEnd w:id="3"/>
-      <w:bookmarkEnd w:id="4"/>
       <w:r>
         <w:t>Learn more</w:t>
       </w:r>
@@ -460,6 +522,96 @@
 <file path=word/numbering.xml><?xml version="1.0" encoding="utf-8"?>
 <w:numbering xmlns:wpc="http://schemas.microsoft.com/office/word/2010/wordprocessingCanvas" xmlns:cx="http://schemas.microsoft.com/office/drawing/2014/chartex" xmlns:cx1="http://schemas.microsoft.com/office/drawing/2015/9/8/chartex" xmlns:cx2="http://schemas.microsoft.com/office/drawing/2015/10/21/chartex" xmlns:cx3="http://schemas.microsoft.com/office/drawing/2016/5/9/chartex" xmlns:cx4="http://schemas.microsoft.com/office/drawing/2016/5/10/chartex" xmlns:cx5="http://schemas.microsoft.com/office/drawing/2016/5/11/chartex" xmlns:cx6="http://schemas.microsoft.com/office/drawing/2016/5/12/chartex" xmlns:cx7="http://schemas.microsoft.com/office/drawing/2016/5/13/chartex" xmlns:cx8="http://schemas.microsoft.com/office/drawing/2016/5/14/chartex" xmlns:mc="http://schemas.openxmlformats.org/markup-compatibility/2006" xmlns:m="http://schemas.openxmlformats.org/officeDocument/2006/math" xmlns:aink="http://schemas.microsoft.com/office/drawing/2016/ink" xmlns:am3d="http://schemas.microsoft.com/office/drawing/2017/model3d" xmlns:oel="http://schemas.microsoft.com/office/2019/extlst" xmlns:r="http://schemas.openxmlformats.org/officeDocument/2006/relationships" xmlns:wp14="http://schemas.microsoft.com/office/word/2010/wordprocessingDrawing" xmlns:wp="http://schemas.openxmlformats.org/drawingml/2006/wordprocessingDrawing" xmlns:wpg="http://schemas.microsoft.com/office/word/2010/wordprocessingGroup" xmlns:wpi="http://schemas.microsoft.com/office/word/2010/wordprocessingInk" xmlns:wps="http://schemas.microsoft.com/office/word/2010/wordprocessingShape" xmlns:o="urn:schemas-microsoft-com:office:office" xmlns:v="urn:schemas-microsoft-com:vml" xmlns:w10="urn:schemas-microsoft-com:office:word" xmlns:w="http://schemas.openxmlformats.org/wordprocessingml/2006/main" xmlns:w14="http://schemas.microsoft.com/office/word/2010/wordml" xmlns:w15="http://schemas.microsoft.com/office/word/2012/wordml" xmlns:w16cex="http://schemas.microsoft.com/office/word/2018/wordml/cex" xmlns:w16cid="http://schemas.microsoft.com/office/word/2016/wordml/cid" xmlns:w16="http://schemas.microsoft.com/office/word/2018/wordml" xmlns:w16sdtdh="http://schemas.microsoft.com/office/word/2020/wordml/sdtdatahash" xmlns:w16sdtfl="http://schemas.microsoft.com/office/word/2024/wordml/sdtformatlock" xmlns:w16se="http://schemas.microsoft.com/office/word/2015/wordml/symex" xmlns:w16du="http://schemas.microsoft.com/office/word/2023/wordml/word16du" xmlns:wne="http://schemas.microsoft.com/office/word/2006/wordml" mc:Ignorable="w14 w15 w16se w16cid w16 w16cex w16sdtdh w16sdtfl w16du wp14">
   <w:abstractNum w:abstractNumId="0" w15:restartNumberingAfterBreak="0">
+    <w:nsid w:val="01E25816"/>
+    <w:multiLevelType w:val="hybridMultilevel"/>
+    <w:tmpl w:val="924276BA"/>
+    <w:lvl w:ilvl="0" w:tplc="FFFFFFFF">
+      <w:start w:val="1"/>
+      <w:numFmt w:val="decimal"/>
+      <w:lvlText w:val="%1."/>
+      <w:lvlJc w:val="left"/>
+      <w:pPr>
+        <w:ind w:left="360" w:hanging="360"/>
+      </w:pPr>
+      <w:rPr>
+        <w:b/>
+        <w:bCs/>
+      </w:rPr>
+    </w:lvl>
+    <w:lvl w:ilvl="1" w:tplc="FFFFFFFF" w:tentative="1">
+      <w:start w:val="1"/>
+      <w:numFmt w:val="lowerLetter"/>
+      <w:lvlText w:val="%2."/>
+      <w:lvlJc w:val="left"/>
+      <w:pPr>
+        <w:ind w:left="1080" w:hanging="360"/>
+      </w:pPr>
+    </w:lvl>
+    <w:lvl w:ilvl="2" w:tplc="FFFFFFFF" w:tentative="1">
+      <w:start w:val="1"/>
+      <w:numFmt w:val="lowerRoman"/>
+      <w:lvlText w:val="%3."/>
+      <w:lvlJc w:val="right"/>
+      <w:pPr>
+        <w:ind w:left="1800" w:hanging="180"/>
+      </w:pPr>
+    </w:lvl>
+    <w:lvl w:ilvl="3" w:tplc="FFFFFFFF" w:tentative="1">
+      <w:start w:val="1"/>
+      <w:numFmt w:val="decimal"/>
+      <w:lvlText w:val="%4."/>
+      <w:lvlJc w:val="left"/>
+      <w:pPr>
+        <w:ind w:left="2520" w:hanging="360"/>
+      </w:pPr>
+    </w:lvl>
+    <w:lvl w:ilvl="4" w:tplc="FFFFFFFF" w:tentative="1">
+      <w:start w:val="1"/>
+      <w:numFmt w:val="lowerLetter"/>
+      <w:lvlText w:val="%5."/>
+      <w:lvlJc w:val="left"/>
+      <w:pPr>
+        <w:ind w:left="3240" w:hanging="360"/>
+      </w:pPr>
+    </w:lvl>
+    <w:lvl w:ilvl="5" w:tplc="FFFFFFFF" w:tentative="1">
+      <w:start w:val="1"/>
+      <w:numFmt w:val="lowerRoman"/>
+      <w:lvlText w:val="%6."/>
+      <w:lvlJc w:val="right"/>
+      <w:pPr>
+        <w:ind w:left="3960" w:hanging="180"/>
+      </w:pPr>
+    </w:lvl>
+    <w:lvl w:ilvl="6" w:tplc="FFFFFFFF" w:tentative="1">
+      <w:start w:val="1"/>
+      <w:numFmt w:val="decimal"/>
+      <w:lvlText w:val="%7."/>
+      <w:lvlJc w:val="left"/>
+      <w:pPr>
+        <w:ind w:left="4680" w:hanging="360"/>
+      </w:pPr>
+    </w:lvl>
+    <w:lvl w:ilvl="7" w:tplc="FFFFFFFF" w:tentative="1">
+      <w:start w:val="1"/>
+      <w:numFmt w:val="lowerLetter"/>
+      <w:lvlText w:val="%8."/>
+      <w:lvlJc w:val="left"/>
+      <w:pPr>
+        <w:ind w:left="5400" w:hanging="360"/>
+      </w:pPr>
+    </w:lvl>
+    <w:lvl w:ilvl="8" w:tplc="FFFFFFFF" w:tentative="1">
+      <w:start w:val="1"/>
+      <w:numFmt w:val="lowerRoman"/>
+      <w:lvlText w:val="%9."/>
+      <w:lvlJc w:val="right"/>
+      <w:pPr>
+        <w:ind w:left="6120" w:hanging="180"/>
+      </w:pPr>
+    </w:lvl>
+  </w:abstractNum>
+  <w:abstractNum w:abstractNumId="1" w15:restartNumberingAfterBreak="0">
     <w:nsid w:val="13F848C7"/>
     <w:multiLevelType w:val="hybridMultilevel"/>
     <w:tmpl w:val="36AA75D2"/>
@@ -548,7 +700,7 @@
       </w:pPr>
     </w:lvl>
   </w:abstractNum>
-  <w:abstractNum w:abstractNumId="1" w15:restartNumberingAfterBreak="0">
+  <w:abstractNum w:abstractNumId="2" w15:restartNumberingAfterBreak="0">
     <w:nsid w:val="2AE269F8"/>
     <w:multiLevelType w:val="multilevel"/>
     <w:tmpl w:val="360CF598"/>
@@ -667,7 +819,7 @@
       </w:rPr>
     </w:lvl>
   </w:abstractNum>
-  <w:abstractNum w:abstractNumId="2" w15:restartNumberingAfterBreak="0">
+  <w:abstractNum w:abstractNumId="3" w15:restartNumberingAfterBreak="0">
     <w:nsid w:val="3FFE3326"/>
     <w:multiLevelType w:val="hybridMultilevel"/>
     <w:tmpl w:val="36AA75D2"/>
@@ -756,7 +908,7 @@
       </w:pPr>
     </w:lvl>
   </w:abstractNum>
-  <w:abstractNum w:abstractNumId="3" w15:restartNumberingAfterBreak="0">
+  <w:abstractNum w:abstractNumId="4" w15:restartNumberingAfterBreak="0">
     <w:nsid w:val="401C3456"/>
     <w:multiLevelType w:val="multilevel"/>
     <w:tmpl w:val="0624027E"/>
@@ -875,7 +1027,7 @@
       </w:rPr>
     </w:lvl>
   </w:abstractNum>
-  <w:abstractNum w:abstractNumId="4" w15:restartNumberingAfterBreak="0">
+  <w:abstractNum w:abstractNumId="5" w15:restartNumberingAfterBreak="0">
     <w:nsid w:val="499D4C36"/>
     <w:multiLevelType w:val="multilevel"/>
     <w:tmpl w:val="CD502C96"/>
@@ -1020,7 +1172,7 @@
       </w:rPr>
     </w:lvl>
   </w:abstractNum>
-  <w:abstractNum w:abstractNumId="5" w15:restartNumberingAfterBreak="0">
+  <w:abstractNum w:abstractNumId="6" w15:restartNumberingAfterBreak="0">
     <w:nsid w:val="525C55F5"/>
     <w:multiLevelType w:val="multilevel"/>
     <w:tmpl w:val="E0D6FD7A"/>
@@ -1139,7 +1291,7 @@
       </w:rPr>
     </w:lvl>
   </w:abstractNum>
-  <w:abstractNum w:abstractNumId="6" w15:restartNumberingAfterBreak="0">
+  <w:abstractNum w:abstractNumId="7" w15:restartNumberingAfterBreak="0">
     <w:nsid w:val="59CF2E90"/>
     <w:multiLevelType w:val="hybridMultilevel"/>
     <w:tmpl w:val="36AA75D2"/>
@@ -1228,7 +1380,7 @@
       </w:pPr>
     </w:lvl>
   </w:abstractNum>
-  <w:abstractNum w:abstractNumId="7" w15:restartNumberingAfterBreak="0">
+  <w:abstractNum w:abstractNumId="8" w15:restartNumberingAfterBreak="0">
     <w:nsid w:val="6D9C44B5"/>
     <w:multiLevelType w:val="multilevel"/>
     <w:tmpl w:val="0DD27E9A"/>
@@ -1323,7 +1475,7 @@
       </w:pPr>
     </w:lvl>
   </w:abstractNum>
-  <w:abstractNum w:abstractNumId="8" w15:restartNumberingAfterBreak="0">
+  <w:abstractNum w:abstractNumId="9" w15:restartNumberingAfterBreak="0">
     <w:nsid w:val="77D572D8"/>
     <w:multiLevelType w:val="multilevel"/>
     <w:tmpl w:val="2784573E"/>
@@ -1442,7 +1594,7 @@
       </w:rPr>
     </w:lvl>
   </w:abstractNum>
-  <w:abstractNum w:abstractNumId="9" w15:restartNumberingAfterBreak="0">
+  <w:abstractNum w:abstractNumId="10" w15:restartNumberingAfterBreak="0">
     <w:nsid w:val="7F680190"/>
     <w:multiLevelType w:val="hybridMultilevel"/>
     <w:tmpl w:val="924276BA"/>
@@ -1533,34 +1685,37 @@
     </w:lvl>
   </w:abstractNum>
   <w:num w:numId="1" w16cid:durableId="775760174">
+    <w:abstractNumId w:val="6"/>
+  </w:num>
+  <w:num w:numId="2" w16cid:durableId="2103338215">
+    <w:abstractNumId w:val="9"/>
+  </w:num>
+  <w:num w:numId="3" w16cid:durableId="1780955862">
+    <w:abstractNumId w:val="2"/>
+  </w:num>
+  <w:num w:numId="4" w16cid:durableId="1151603996">
+    <w:abstractNumId w:val="4"/>
+  </w:num>
+  <w:num w:numId="5" w16cid:durableId="394549212">
+    <w:abstractNumId w:val="8"/>
+  </w:num>
+  <w:num w:numId="6" w16cid:durableId="1175656920">
     <w:abstractNumId w:val="5"/>
   </w:num>
-  <w:num w:numId="2" w16cid:durableId="2103338215">
-    <w:abstractNumId w:val="8"/>
-  </w:num>
-  <w:num w:numId="3" w16cid:durableId="1780955862">
+  <w:num w:numId="7" w16cid:durableId="1448889051">
     <w:abstractNumId w:val="1"/>
   </w:num>
-  <w:num w:numId="4" w16cid:durableId="1151603996">
+  <w:num w:numId="8" w16cid:durableId="662054328">
     <w:abstractNumId w:val="3"/>
   </w:num>
-  <w:num w:numId="5" w16cid:durableId="394549212">
+  <w:num w:numId="9" w16cid:durableId="28380477">
     <w:abstractNumId w:val="7"/>
   </w:num>
-  <w:num w:numId="6" w16cid:durableId="1175656920">
-    <w:abstractNumId w:val="4"/>
+  <w:num w:numId="10" w16cid:durableId="581917544">
+    <w:abstractNumId w:val="10"/>
   </w:num>
-  <w:num w:numId="7" w16cid:durableId="1448889051">
+  <w:num w:numId="11" w16cid:durableId="189536918">
     <w:abstractNumId w:val="0"/>
-  </w:num>
-  <w:num w:numId="8" w16cid:durableId="662054328">
-    <w:abstractNumId w:val="2"/>
-  </w:num>
-  <w:num w:numId="9" w16cid:durableId="28380477">
-    <w:abstractNumId w:val="6"/>
-  </w:num>
-  <w:num w:numId="10" w16cid:durableId="581917544">
-    <w:abstractNumId w:val="9"/>
   </w:num>
 </w:numbering>
 </file>

</xml_diff>

<commit_message>
Updated next steps document
</commit_message>
<xml_diff>
--- a/docassemble/NDPowerOfAttorneyForCareAndCustodyOfMinor/data/templates/nd_power_of_attorney_minor_short_form_v2_next_steps.docx
+++ b/docassemble/NDPowerOfAttorneyForCareAndCustodyOfMinor/data/templates/nd_power_of_attorney_minor_short_form_v2_next_steps.docx
@@ -48,10 +48,10 @@
         <w:t xml:space="preserve"> }}</w:t>
       </w:r>
       <w:r>
-        <w:t xml:space="preserve">! You have finished </w:t>
-      </w:r>
-      <w:r>
-        <w:t>your form.</w:t>
+        <w:t xml:space="preserve">! You have </w:t>
+      </w:r>
+      <w:r>
+        <w:t>filled out your form, but there may be more for you to do.</w:t>
       </w:r>
     </w:p>
     <w:p>
@@ -103,7 +103,19 @@
         <w:t>form again</w:t>
       </w:r>
       <w:r>
-        <w:t xml:space="preserve">. Make sure everything is correct. </w:t>
+        <w:t>. Make sure everything is correct.</w:t>
+      </w:r>
+    </w:p>
+    <w:p>
+      <w:pPr>
+        <w:pStyle w:val="NumberedList"/>
+        <w:numPr>
+          <w:ilvl w:val="0"/>
+          <w:numId w:val="3"/>
+        </w:numPr>
+      </w:pPr>
+      <w:r>
+        <w:t>{%p if not with_notary_now %}</w:t>
       </w:r>
     </w:p>
     <w:p>
@@ -115,13 +127,16 @@
         </w:numPr>
       </w:pPr>
       <w:r>
-        <w:t>If you did not sign the form online</w:t>
-      </w:r>
-      <w:r>
-        <w:t xml:space="preserve">, </w:t>
-      </w:r>
-      <w:r>
-        <w:t xml:space="preserve">wait to sign it until you are </w:t>
+        <w:t>W</w:t>
+      </w:r>
+      <w:r>
+        <w:t xml:space="preserve">ait to sign </w:t>
+      </w:r>
+      <w:r>
+        <w:t xml:space="preserve">your form </w:t>
+      </w:r>
+      <w:r>
+        <w:t xml:space="preserve">until you are </w:t>
       </w:r>
       <w:r>
         <w:t>with a notary or court clerk.</w:t>
@@ -136,7 +151,7 @@
         </w:numPr>
       </w:pPr>
       <w:r>
-        <w:t>If you signed the form online with a notary or court clerk, you are done.</w:t>
+        <w:t>{%p endif %}</w:t>
       </w:r>
     </w:p>
     <w:p>
@@ -239,19 +254,7 @@
         </w:numPr>
       </w:pPr>
       <w:r>
-        <w:t xml:space="preserve">{{ attorney_in_fact[0] }} can </w:t>
-      </w:r>
-      <w:r>
-        <w:t xml:space="preserve">now </w:t>
-      </w:r>
-      <w:r>
-        <w:t xml:space="preserve">make choices </w:t>
-      </w:r>
-      <w:r>
-        <w:t>for your child(ren)</w:t>
-      </w:r>
-      <w:r>
-        <w:t>. They can care for your child(ren) in the ways you chose. They cannot consent to marriage or adoption.</w:t>
+        <w:t>{{ attorney_in_fact[0] }} can now make choices for your child(ren). They can care for your child(ren) in the ways you chose. They cannot consent to marriage or adoption.</w:t>
       </w:r>
     </w:p>
     <w:p>
@@ -263,10 +266,7 @@
         </w:numPr>
       </w:pPr>
       <w:r>
-        <w:t xml:space="preserve">{{ attorney_in_fact[0] }} </w:t>
-      </w:r>
-      <w:r>
-        <w:t>should keep a copy of the form. They may need to show it to your child(ren)’s school, doctors, or other places where decisions are made.</w:t>
+        <w:t>{{ attorney_in_fact[0] }} should keep a copy of the form. They may need to show it to your child(ren)’s school, doctors, or other places where decisions are made.</w:t>
       </w:r>
     </w:p>
     <w:p>

</xml_diff>